<commit_message>
Professional polish pass: remove em-dashes, bilingual headers, tighter layout, block icons
- Removed every em-dash from generated content (1128 in data files + templates), replaced with natural punctuation
- Added PT/EN bilingual headers throughout: step labels, block names, cover eyebrow, Sumario/TOC, front matter sections
- Designed 13 original line-icon graphics (one per block), embedded in every chapter header, block divider page, and the DOCX equivalents
- Tightened spacing across HTML and DOCX templates (margins, line-height, table/list padding) for a denser, more professional layout
- Regenerated all 104 standalone chapters and the compiled master PDF/DOCX (433 pages) with the new design
</commit_message>
<xml_diff>
--- a/ebook/output/Tema-01-talking-about-yourself-beyond-the.docx
+++ b/ebook/output/Tema-01-talking-about-yourself-beyond-the.docx
@@ -15,20 +15,104 @@
         </w:tblBorders>
       </w:tblPr>
       <w:tblGrid>
-        <w:gridCol w:w="9200"/>
+        <w:gridCol w:w="1200"/>
+        <w:gridCol w:w="8000"/>
       </w:tblGrid>
       <w:tr>
         <w:tc>
           <w:tcPr>
-            <w:tcW w:type="dxa" w:w="9200"/>
+            <w:tcW w:type="dxa" w:w="1200"/>
             <w:shd w:fill="1B3B57" w:val="clear"/>
             <w:tcMar>
-              <w:top w:type="dxa" w:w="300"/>
-              <w:left w:type="dxa" w:w="300"/>
-              <w:bottom w:type="dxa" w:w="300"/>
-              <w:right w:type="dxa" w:w="300"/>
-            </w:tcMar>
-          </w:tcPr>
+              <w:top w:type="dxa" w:w="260"/>
+              <w:left w:type="dxa" w:w="200"/>
+              <w:bottom w:type="dxa" w:w="260"/>
+              <w:right w:type="dxa" w:w="100"/>
+            </w:tcMar>
+            <w:vAlign w:val="center"/>
+          </w:tcPr>
+          <w:p>
+            <w:r>
+              <w:drawing>
+                <wp:inline distT="0" distB="0" distL="0" distR="0">
+                  <wp:extent cx="419100" cy="419100"/>
+                  <wp:effectExtent t="0" r="0" b="0" l="0"/>
+                  <wp:docPr id="1" name="" descr="" title=""/>
+                  <wp:cNvGraphicFramePr>
+                    <a:graphicFrameLocks xmlns:a="http://schemas.openxmlformats.org/drawingml/2006/main" noChangeAspect="1"/>
+                  </wp:cNvGraphicFramePr>
+                  <a:graphic xmlns:a="http://schemas.openxmlformats.org/drawingml/2006/main">
+                    <a:graphicData uri="http://schemas.openxmlformats.org/drawingml/2006/picture">
+                      <pic:pic xmlns:pic="http://schemas.openxmlformats.org/drawingml/2006/picture">
+                        <pic:nvPicPr>
+                          <pic:cNvPr id="0" name="" descr=""/>
+                          <pic:cNvPicPr>
+                            <a:picLocks noChangeAspect="1" noChangeArrowheads="1"/>
+                          </pic:cNvPicPr>
+                        </pic:nvPicPr>
+                        <pic:blipFill>
+                          <a:blip r:embed="rId9" cstate="none"/>
+                          <a:srcRect/>
+                          <a:stretch>
+                            <a:fillRect/>
+                          </a:stretch>
+                        </pic:blipFill>
+                        <pic:spPr bwMode="auto">
+                          <a:xfrm>
+                            <a:off x="0" y="0"/>
+                            <a:ext cx="419100" cy="419100"/>
+                          </a:xfrm>
+                          <a:prstGeom prst="rect">
+                            <a:avLst/>
+                          </a:prstGeom>
+                        </pic:spPr>
+                      </pic:pic>
+                    </a:graphicData>
+                  </a:graphic>
+                </wp:inline>
+              </w:drawing>
+            </w:r>
+          </w:p>
+        </w:tc>
+        <w:tc>
+          <w:tcPr>
+            <w:tcW w:type="dxa" w:w="8000"/>
+            <w:shd w:fill="1B3B57" w:val="clear"/>
+            <w:tcMar>
+              <w:top w:type="dxa" w:w="260"/>
+              <w:left w:type="dxa" w:w="100"/>
+              <w:bottom w:type="dxa" w:w="260"/>
+              <w:right w:type="dxa" w:w="260"/>
+            </w:tcMar>
+          </w:tcPr>
+          <w:p>
+            <w:pPr>
+              <w:spacing w:after="40"/>
+            </w:pPr>
+            <w:r>
+              <w:rPr>
+                <w:rFonts w:ascii="Calibri" w:cs="Calibri" w:eastAsia="Calibri" w:hAnsi="Calibri"/>
+                <w:b/>
+                <w:bCs/>
+                <w:color w:val="8fc4ec"/>
+                <w:sz w:val="18"/>
+                <w:szCs w:val="18"/>
+              </w:rPr>
+              <w:t xml:space="preserve">TEMA 1  ·  BLOCO 1  ·  FUNDAMENTOS DA CONVERSAÇÃO</w:t>
+            </w:r>
+            <w:r>
+              <w:rPr>
+                <w:rFonts w:ascii="Calibri" w:cs="Calibri" w:eastAsia="Calibri" w:hAnsi="Calibri"/>
+                <w:i/>
+                <w:iCs/>
+                <w:color w:val="5F87A3"/>
+                <w:sz w:val="14"/>
+                <w:szCs w:val="14"/>
+              </w:rPr>
+              <w:br/>
+              <w:t xml:space="preserve">THEME 1 · BLOCK 1 · CONVERSATION FUNDAMENTALS</w:t>
+            </w:r>
+          </w:p>
           <w:p>
             <w:pPr>
               <w:spacing w:after="60"/>
@@ -38,25 +122,9 @@
                 <w:rFonts w:ascii="Calibri" w:cs="Calibri" w:eastAsia="Calibri" w:hAnsi="Calibri"/>
                 <w:b/>
                 <w:bCs/>
-                <w:color w:val="8fc4ec"/>
-                <w:sz w:val="20"/>
-                <w:szCs w:val="20"/>
-              </w:rPr>
-              <w:t xml:space="preserve">TEMA 1  ·  BLOCO 1 — FUNDAMENTOS DA CONVERSAÇÃO</w:t>
-            </w:r>
-          </w:p>
-          <w:p>
-            <w:pPr>
-              <w:spacing w:after="80"/>
-            </w:pPr>
-            <w:r>
-              <w:rPr>
-                <w:rFonts w:ascii="Calibri" w:cs="Calibri" w:eastAsia="Calibri" w:hAnsi="Calibri"/>
-                <w:b/>
-                <w:bCs/>
                 <w:color w:val="FFFFFF"/>
-                <w:sz w:val="40"/>
-                <w:szCs w:val="40"/>
+                <w:sz w:val="38"/>
+                <w:szCs w:val="38"/>
               </w:rPr>
               <w:t xml:space="preserve">Talking About Yourself Beyond the Basics</w:t>
             </w:r>
@@ -68,8 +136,8 @@
                 <w:i/>
                 <w:iCs/>
                 <w:color w:val="C9D6E3"/>
-                <w:sz w:val="24"/>
-                <w:szCs w:val="24"/>
+                <w:sz w:val="22"/>
+                <w:szCs w:val="22"/>
               </w:rPr>
               <w:t xml:space="preserve">Falando sobre você além do básico</w:t>
             </w:r>
@@ -79,7 +147,7 @@
     </w:tbl>
     <w:p>
       <w:pPr>
-        <w:spacing w:after="100" w:before="240"/>
+        <w:spacing w:after="80" w:before="180"/>
       </w:pPr>
       <w:r>
         <w:rPr>
@@ -87,8 +155,8 @@
           <w:b/>
           <w:bCs/>
           <w:color w:val="1B3B57"/>
-          <w:sz w:val="21"/>
-          <w:szCs w:val="21"/>
+          <w:sz w:val="20"/>
+          <w:szCs w:val="20"/>
         </w:rPr>
         <w:t xml:space="preserve">Tempo estimado: </w:t>
       </w:r>
@@ -96,15 +164,15 @@
         <w:rPr>
           <w:rFonts w:ascii="Calibri" w:cs="Calibri" w:eastAsia="Calibri" w:hAnsi="Calibri"/>
           <w:color w:val="444444"/>
-          <w:sz w:val="21"/>
-          <w:szCs w:val="21"/>
+          <w:sz w:val="20"/>
+          <w:szCs w:val="20"/>
         </w:rPr>
         <w:t xml:space="preserve">60–90 minutos, divididos ao longo da semana.</w:t>
       </w:r>
     </w:p>
     <w:p>
       <w:pPr>
-        <w:spacing w:after="160" w:line="300"/>
+        <w:spacing w:after="120" w:line="276"/>
       </w:pPr>
       <w:r>
         <w:rPr>
@@ -114,8 +182,8 @@
           <w:i w:val="false"/>
           <w:iCs w:val="false"/>
           <w:color w:val="444444"/>
-          <w:sz w:val="22"/>
-          <w:szCs w:val="22"/>
+          <w:sz w:val="21"/>
+          <w:szCs w:val="21"/>
         </w:rPr>
         <w:t xml:space="preserve">Este é o primeiro tema do e-book, e por isso ele é também o mais fundamental: antes de discutir liderança, negociação ou carreira, você precisa conseguir falar sobre si mesmo de forma mais rica do que "I'm fine, I work in marketing." Este tema te prepara para ir além do piloto automático.</w:t>
       </w:r>
@@ -123,7 +191,7 @@
     <w:p>
       <w:pPr>
         <w:shd w:fill="2E86C1" w:val="clear"/>
-        <w:spacing w:after="150" w:before="500"/>
+        <w:spacing w:after="110" w:before="340"/>
       </w:pPr>
       <w:r>
         <w:rPr>
@@ -131,8 +199,8 @@
           <w:b/>
           <w:bCs/>
           <w:color w:val="FFFFFF"/>
-          <w:sz w:val="20"/>
-          <w:szCs w:val="20"/>
+          <w:sz w:val="18"/>
+          <w:szCs w:val="18"/>
         </w:rPr>
         <w:t xml:space="preserve">  ETAPA 1  </w:t>
       </w:r>
@@ -142,15 +210,27 @@
           <w:b/>
           <w:bCs/>
           <w:color w:val="FFFFFF"/>
-          <w:sz w:val="24"/>
-          <w:szCs w:val="24"/>
+          <w:sz w:val="23"/>
+          <w:szCs w:val="23"/>
         </w:rPr>
         <w:t xml:space="preserve">   Vocabulário Contextualizado</w:t>
       </w:r>
-    </w:p>
-    <w:p>
-      <w:pPr>
-        <w:spacing w:after="160" w:line="300"/>
+      <w:r>
+        <w:rPr>
+          <w:rFonts w:ascii="Calibri" w:cs="Calibri" w:eastAsia="Calibri" w:hAnsi="Calibri"/>
+          <w:i/>
+          <w:iCs/>
+          <w:color w:val="D8E7F2"/>
+          <w:sz w:val="17"/>
+          <w:szCs w:val="17"/>
+        </w:rPr>
+        <w:br/>
+        <w:t xml:space="preserve">   Contextualized Vocabulary</w:t>
+      </w:r>
+    </w:p>
+    <w:p>
+      <w:pPr>
+        <w:spacing w:after="120" w:line="276"/>
       </w:pPr>
       <w:r>
         <w:rPr>
@@ -160,8 +240,8 @@
           <w:i w:val="false"/>
           <w:iCs w:val="false"/>
           <w:color w:val="444444"/>
-          <w:sz w:val="22"/>
-          <w:szCs w:val="22"/>
+          <w:sz w:val="21"/>
+          <w:szCs w:val="21"/>
         </w:rPr>
         <w:t xml:space="preserve">Estas palavras e expressões vão te ajudar a se expressar sobre este tema com mais precisão e naturalidade.</w:t>
       </w:r>
@@ -192,10 +272,10 @@
             <w:tcW w:type="dxa" w:w="2600"/>
             <w:shd w:fill="2E86C1" w:val="clear"/>
             <w:tcMar>
-              <w:top w:type="dxa" w:w="100"/>
-              <w:left w:type="dxa" w:w="120"/>
-              <w:bottom w:type="dxa" w:w="100"/>
-              <w:right w:type="dxa" w:w="120"/>
+              <w:top w:type="dxa" w:w="80"/>
+              <w:left w:type="dxa" w:w="110"/>
+              <w:bottom w:type="dxa" w:w="80"/>
+              <w:right w:type="dxa" w:w="110"/>
             </w:tcMar>
             <w:vAlign w:val="center"/>
           </w:tcPr>
@@ -206,8 +286,8 @@
                 <w:b/>
                 <w:bCs/>
                 <w:color w:val="FFFFFF"/>
-                <w:sz w:val="20"/>
-                <w:szCs w:val="20"/>
+                <w:sz w:val="19"/>
+                <w:szCs w:val="19"/>
               </w:rPr>
               <w:t xml:space="preserve">Word / Expression</w:t>
             </w:r>
@@ -218,10 +298,10 @@
             <w:tcW w:type="dxa" w:w="2000"/>
             <w:shd w:fill="2E86C1" w:val="clear"/>
             <w:tcMar>
-              <w:top w:type="dxa" w:w="100"/>
-              <w:left w:type="dxa" w:w="120"/>
-              <w:bottom w:type="dxa" w:w="100"/>
-              <w:right w:type="dxa" w:w="120"/>
+              <w:top w:type="dxa" w:w="80"/>
+              <w:left w:type="dxa" w:w="110"/>
+              <w:bottom w:type="dxa" w:w="80"/>
+              <w:right w:type="dxa" w:w="110"/>
             </w:tcMar>
             <w:vAlign w:val="center"/>
           </w:tcPr>
@@ -232,8 +312,8 @@
                 <w:b/>
                 <w:bCs/>
                 <w:color w:val="FFFFFF"/>
-                <w:sz w:val="20"/>
-                <w:szCs w:val="20"/>
+                <w:sz w:val="19"/>
+                <w:szCs w:val="19"/>
               </w:rPr>
               <w:t xml:space="preserve">Tradução</w:t>
             </w:r>
@@ -244,10 +324,10 @@
             <w:tcW w:type="dxa" w:w="4600"/>
             <w:shd w:fill="2E86C1" w:val="clear"/>
             <w:tcMar>
-              <w:top w:type="dxa" w:w="100"/>
-              <w:left w:type="dxa" w:w="120"/>
-              <w:bottom w:type="dxa" w:w="100"/>
-              <w:right w:type="dxa" w:w="120"/>
+              <w:top w:type="dxa" w:w="80"/>
+              <w:left w:type="dxa" w:w="110"/>
+              <w:bottom w:type="dxa" w:w="80"/>
+              <w:right w:type="dxa" w:w="110"/>
             </w:tcMar>
             <w:vAlign w:val="center"/>
           </w:tcPr>
@@ -258,8 +338,8 @@
                 <w:b/>
                 <w:bCs/>
                 <w:color w:val="FFFFFF"/>
-                <w:sz w:val="20"/>
-                <w:szCs w:val="20"/>
+                <w:sz w:val="19"/>
+                <w:szCs w:val="19"/>
               </w:rPr>
               <w:t xml:space="preserve">Example Sentence</w:t>
             </w:r>
@@ -271,10 +351,10 @@
           <w:tcPr>
             <w:tcW w:type="dxa" w:w="2600"/>
             <w:tcMar>
-              <w:top w:type="dxa" w:w="90"/>
-              <w:left w:type="dxa" w:w="120"/>
-              <w:bottom w:type="dxa" w:w="90"/>
-              <w:right w:type="dxa" w:w="120"/>
+              <w:top w:type="dxa" w:w="70"/>
+              <w:left w:type="dxa" w:w="110"/>
+              <w:bottom w:type="dxa" w:w="70"/>
+              <w:right w:type="dxa" w:w="110"/>
             </w:tcMar>
             <w:vAlign w:val="center"/>
           </w:tcPr>
@@ -287,8 +367,8 @@
                 <w:i w:val="false"/>
                 <w:iCs w:val="false"/>
                 <w:color w:val="444444"/>
-                <w:sz w:val="20"/>
-                <w:szCs w:val="20"/>
+                <w:sz w:val="19"/>
+                <w:szCs w:val="19"/>
               </w:rPr>
               <w:t xml:space="preserve">background</w:t>
             </w:r>
@@ -298,24 +378,24 @@
           <w:tcPr>
             <w:tcW w:type="dxa" w:w="2000"/>
             <w:tcMar>
-              <w:top w:type="dxa" w:w="90"/>
-              <w:left w:type="dxa" w:w="120"/>
-              <w:bottom w:type="dxa" w:w="90"/>
-              <w:right w:type="dxa" w:w="120"/>
-            </w:tcMar>
-            <w:vAlign w:val="center"/>
-          </w:tcPr>
-          <w:p>
-            <w:r>
-              <w:rPr>
-                <w:rFonts w:ascii="Calibri" w:cs="Calibri" w:eastAsia="Calibri" w:hAnsi="Calibri"/>
-                <w:b w:val="false"/>
-                <w:bCs w:val="false"/>
-                <w:i w:val="false"/>
-                <w:iCs w:val="false"/>
-                <w:color w:val="444444"/>
-                <w:sz w:val="20"/>
-                <w:szCs w:val="20"/>
+              <w:top w:type="dxa" w:w="70"/>
+              <w:left w:type="dxa" w:w="110"/>
+              <w:bottom w:type="dxa" w:w="70"/>
+              <w:right w:type="dxa" w:w="110"/>
+            </w:tcMar>
+            <w:vAlign w:val="center"/>
+          </w:tcPr>
+          <w:p>
+            <w:r>
+              <w:rPr>
+                <w:rFonts w:ascii="Calibri" w:cs="Calibri" w:eastAsia="Calibri" w:hAnsi="Calibri"/>
+                <w:b w:val="false"/>
+                <w:bCs w:val="false"/>
+                <w:i w:val="false"/>
+                <w:iCs w:val="false"/>
+                <w:color w:val="444444"/>
+                <w:sz w:val="19"/>
+                <w:szCs w:val="19"/>
               </w:rPr>
               <w:t xml:space="preserve">trajetória / bagagem</w:t>
             </w:r>
@@ -325,10 +405,10 @@
           <w:tcPr>
             <w:tcW w:type="dxa" w:w="4600"/>
             <w:tcMar>
-              <w:top w:type="dxa" w:w="90"/>
-              <w:left w:type="dxa" w:w="120"/>
-              <w:bottom w:type="dxa" w:w="90"/>
-              <w:right w:type="dxa" w:w="120"/>
+              <w:top w:type="dxa" w:w="70"/>
+              <w:left w:type="dxa" w:w="110"/>
+              <w:bottom w:type="dxa" w:w="70"/>
+              <w:right w:type="dxa" w:w="110"/>
             </w:tcMar>
             <w:vAlign w:val="center"/>
           </w:tcPr>
@@ -341,8 +421,8 @@
                 <w:i/>
                 <w:iCs/>
                 <w:color w:val="444444"/>
-                <w:sz w:val="20"/>
-                <w:szCs w:val="20"/>
+                <w:sz w:val="19"/>
+                <w:szCs w:val="19"/>
               </w:rPr>
               <w:t xml:space="preserve">My background is in finance, but I moved into product management five years ago.</w:t>
             </w:r>
@@ -354,10 +434,10 @@
           <w:tcPr>
             <w:tcW w:type="dxa" w:w="2600"/>
             <w:tcMar>
-              <w:top w:type="dxa" w:w="90"/>
-              <w:left w:type="dxa" w:w="120"/>
-              <w:bottom w:type="dxa" w:w="90"/>
-              <w:right w:type="dxa" w:w="120"/>
+              <w:top w:type="dxa" w:w="70"/>
+              <w:left w:type="dxa" w:w="110"/>
+              <w:bottom w:type="dxa" w:w="70"/>
+              <w:right w:type="dxa" w:w="110"/>
             </w:tcMar>
             <w:vAlign w:val="center"/>
           </w:tcPr>
@@ -370,8 +450,8 @@
                 <w:i w:val="false"/>
                 <w:iCs w:val="false"/>
                 <w:color w:val="444444"/>
-                <w:sz w:val="20"/>
-                <w:szCs w:val="20"/>
+                <w:sz w:val="19"/>
+                <w:szCs w:val="19"/>
               </w:rPr>
               <w:t xml:space="preserve">to be rooted in (something)</w:t>
             </w:r>
@@ -381,24 +461,24 @@
           <w:tcPr>
             <w:tcW w:type="dxa" w:w="2000"/>
             <w:tcMar>
-              <w:top w:type="dxa" w:w="90"/>
-              <w:left w:type="dxa" w:w="120"/>
-              <w:bottom w:type="dxa" w:w="90"/>
-              <w:right w:type="dxa" w:w="120"/>
-            </w:tcMar>
-            <w:vAlign w:val="center"/>
-          </w:tcPr>
-          <w:p>
-            <w:r>
-              <w:rPr>
-                <w:rFonts w:ascii="Calibri" w:cs="Calibri" w:eastAsia="Calibri" w:hAnsi="Calibri"/>
-                <w:b w:val="false"/>
-                <w:bCs w:val="false"/>
-                <w:i w:val="false"/>
-                <w:iCs w:val="false"/>
-                <w:color w:val="444444"/>
-                <w:sz w:val="20"/>
-                <w:szCs w:val="20"/>
+              <w:top w:type="dxa" w:w="70"/>
+              <w:left w:type="dxa" w:w="110"/>
+              <w:bottom w:type="dxa" w:w="70"/>
+              <w:right w:type="dxa" w:w="110"/>
+            </w:tcMar>
+            <w:vAlign w:val="center"/>
+          </w:tcPr>
+          <w:p>
+            <w:r>
+              <w:rPr>
+                <w:rFonts w:ascii="Calibri" w:cs="Calibri" w:eastAsia="Calibri" w:hAnsi="Calibri"/>
+                <w:b w:val="false"/>
+                <w:bCs w:val="false"/>
+                <w:i w:val="false"/>
+                <w:iCs w:val="false"/>
+                <w:color w:val="444444"/>
+                <w:sz w:val="19"/>
+                <w:szCs w:val="19"/>
               </w:rPr>
               <w:t xml:space="preserve">ter raízes em / vir de</w:t>
             </w:r>
@@ -408,10 +488,10 @@
           <w:tcPr>
             <w:tcW w:type="dxa" w:w="4600"/>
             <w:tcMar>
-              <w:top w:type="dxa" w:w="90"/>
-              <w:left w:type="dxa" w:w="120"/>
-              <w:bottom w:type="dxa" w:w="90"/>
-              <w:right w:type="dxa" w:w="120"/>
+              <w:top w:type="dxa" w:w="70"/>
+              <w:left w:type="dxa" w:w="110"/>
+              <w:bottom w:type="dxa" w:w="70"/>
+              <w:right w:type="dxa" w:w="110"/>
             </w:tcMar>
             <w:vAlign w:val="center"/>
           </w:tcPr>
@@ -424,8 +504,8 @@
                 <w:i/>
                 <w:iCs/>
                 <w:color w:val="444444"/>
-                <w:sz w:val="20"/>
-                <w:szCs w:val="20"/>
+                <w:sz w:val="19"/>
+                <w:szCs w:val="19"/>
               </w:rPr>
               <w:t xml:space="preserve">A lot of who I am professionally is rooted in how I was raised.</w:t>
             </w:r>
@@ -437,10 +517,10 @@
           <w:tcPr>
             <w:tcW w:type="dxa" w:w="2600"/>
             <w:tcMar>
-              <w:top w:type="dxa" w:w="90"/>
-              <w:left w:type="dxa" w:w="120"/>
-              <w:bottom w:type="dxa" w:w="90"/>
-              <w:right w:type="dxa" w:w="120"/>
+              <w:top w:type="dxa" w:w="70"/>
+              <w:left w:type="dxa" w:w="110"/>
+              <w:bottom w:type="dxa" w:w="70"/>
+              <w:right w:type="dxa" w:w="110"/>
             </w:tcMar>
             <w:vAlign w:val="center"/>
           </w:tcPr>
@@ -453,8 +533,8 @@
                 <w:i w:val="false"/>
                 <w:iCs w:val="false"/>
                 <w:color w:val="444444"/>
-                <w:sz w:val="20"/>
-                <w:szCs w:val="20"/>
+                <w:sz w:val="19"/>
+                <w:szCs w:val="19"/>
               </w:rPr>
               <w:t xml:space="preserve">outgoing</w:t>
             </w:r>
@@ -464,24 +544,24 @@
           <w:tcPr>
             <w:tcW w:type="dxa" w:w="2000"/>
             <w:tcMar>
-              <w:top w:type="dxa" w:w="90"/>
-              <w:left w:type="dxa" w:w="120"/>
-              <w:bottom w:type="dxa" w:w="90"/>
-              <w:right w:type="dxa" w:w="120"/>
-            </w:tcMar>
-            <w:vAlign w:val="center"/>
-          </w:tcPr>
-          <w:p>
-            <w:r>
-              <w:rPr>
-                <w:rFonts w:ascii="Calibri" w:cs="Calibri" w:eastAsia="Calibri" w:hAnsi="Calibri"/>
-                <w:b w:val="false"/>
-                <w:bCs w:val="false"/>
-                <w:i w:val="false"/>
-                <w:iCs w:val="false"/>
-                <w:color w:val="444444"/>
-                <w:sz w:val="20"/>
-                <w:szCs w:val="20"/>
+              <w:top w:type="dxa" w:w="70"/>
+              <w:left w:type="dxa" w:w="110"/>
+              <w:bottom w:type="dxa" w:w="70"/>
+              <w:right w:type="dxa" w:w="110"/>
+            </w:tcMar>
+            <w:vAlign w:val="center"/>
+          </w:tcPr>
+          <w:p>
+            <w:r>
+              <w:rPr>
+                <w:rFonts w:ascii="Calibri" w:cs="Calibri" w:eastAsia="Calibri" w:hAnsi="Calibri"/>
+                <w:b w:val="false"/>
+                <w:bCs w:val="false"/>
+                <w:i w:val="false"/>
+                <w:iCs w:val="false"/>
+                <w:color w:val="444444"/>
+                <w:sz w:val="19"/>
+                <w:szCs w:val="19"/>
               </w:rPr>
               <w:t xml:space="preserve">extrovertido(a)</w:t>
             </w:r>
@@ -491,10 +571,10 @@
           <w:tcPr>
             <w:tcW w:type="dxa" w:w="4600"/>
             <w:tcMar>
-              <w:top w:type="dxa" w:w="90"/>
-              <w:left w:type="dxa" w:w="120"/>
-              <w:bottom w:type="dxa" w:w="90"/>
-              <w:right w:type="dxa" w:w="120"/>
+              <w:top w:type="dxa" w:w="70"/>
+              <w:left w:type="dxa" w:w="110"/>
+              <w:bottom w:type="dxa" w:w="70"/>
+              <w:right w:type="dxa" w:w="110"/>
             </w:tcMar>
             <w:vAlign w:val="center"/>
           </w:tcPr>
@@ -507,8 +587,8 @@
                 <w:i/>
                 <w:iCs/>
                 <w:color w:val="444444"/>
-                <w:sz w:val="20"/>
-                <w:szCs w:val="20"/>
+                <w:sz w:val="19"/>
+                <w:szCs w:val="19"/>
               </w:rPr>
               <w:t xml:space="preserve">I'd say I'm fairly outgoing, especially once I get comfortable with a group.</w:t>
             </w:r>
@@ -520,10 +600,10 @@
           <w:tcPr>
             <w:tcW w:type="dxa" w:w="2600"/>
             <w:tcMar>
-              <w:top w:type="dxa" w:w="90"/>
-              <w:left w:type="dxa" w:w="120"/>
-              <w:bottom w:type="dxa" w:w="90"/>
-              <w:right w:type="dxa" w:w="120"/>
+              <w:top w:type="dxa" w:w="70"/>
+              <w:left w:type="dxa" w:w="110"/>
+              <w:bottom w:type="dxa" w:w="70"/>
+              <w:right w:type="dxa" w:w="110"/>
             </w:tcMar>
             <w:vAlign w:val="center"/>
           </w:tcPr>
@@ -536,8 +616,8 @@
                 <w:i w:val="false"/>
                 <w:iCs w:val="false"/>
                 <w:color w:val="444444"/>
-                <w:sz w:val="20"/>
-                <w:szCs w:val="20"/>
+                <w:sz w:val="19"/>
+                <w:szCs w:val="19"/>
               </w:rPr>
               <w:t xml:space="preserve">reserved</w:t>
             </w:r>
@@ -547,24 +627,24 @@
           <w:tcPr>
             <w:tcW w:type="dxa" w:w="2000"/>
             <w:tcMar>
-              <w:top w:type="dxa" w:w="90"/>
-              <w:left w:type="dxa" w:w="120"/>
-              <w:bottom w:type="dxa" w:w="90"/>
-              <w:right w:type="dxa" w:w="120"/>
-            </w:tcMar>
-            <w:vAlign w:val="center"/>
-          </w:tcPr>
-          <w:p>
-            <w:r>
-              <w:rPr>
-                <w:rFonts w:ascii="Calibri" w:cs="Calibri" w:eastAsia="Calibri" w:hAnsi="Calibri"/>
-                <w:b w:val="false"/>
-                <w:bCs w:val="false"/>
-                <w:i w:val="false"/>
-                <w:iCs w:val="false"/>
-                <w:color w:val="444444"/>
-                <w:sz w:val="20"/>
-                <w:szCs w:val="20"/>
+              <w:top w:type="dxa" w:w="70"/>
+              <w:left w:type="dxa" w:w="110"/>
+              <w:bottom w:type="dxa" w:w="70"/>
+              <w:right w:type="dxa" w:w="110"/>
+            </w:tcMar>
+            <w:vAlign w:val="center"/>
+          </w:tcPr>
+          <w:p>
+            <w:r>
+              <w:rPr>
+                <w:rFonts w:ascii="Calibri" w:cs="Calibri" w:eastAsia="Calibri" w:hAnsi="Calibri"/>
+                <w:b w:val="false"/>
+                <w:bCs w:val="false"/>
+                <w:i w:val="false"/>
+                <w:iCs w:val="false"/>
+                <w:color w:val="444444"/>
+                <w:sz w:val="19"/>
+                <w:szCs w:val="19"/>
               </w:rPr>
               <w:t xml:space="preserve">reservado(a)</w:t>
             </w:r>
@@ -574,10 +654,10 @@
           <w:tcPr>
             <w:tcW w:type="dxa" w:w="4600"/>
             <w:tcMar>
-              <w:top w:type="dxa" w:w="90"/>
-              <w:left w:type="dxa" w:w="120"/>
-              <w:bottom w:type="dxa" w:w="90"/>
-              <w:right w:type="dxa" w:w="120"/>
+              <w:top w:type="dxa" w:w="70"/>
+              <w:left w:type="dxa" w:w="110"/>
+              <w:bottom w:type="dxa" w:w="70"/>
+              <w:right w:type="dxa" w:w="110"/>
             </w:tcMar>
             <w:vAlign w:val="center"/>
           </w:tcPr>
@@ -590,8 +670,8 @@
                 <w:i/>
                 <w:iCs/>
                 <w:color w:val="444444"/>
-                <w:sz w:val="20"/>
-                <w:szCs w:val="20"/>
+                <w:sz w:val="19"/>
+                <w:szCs w:val="19"/>
               </w:rPr>
               <w:t xml:space="preserve">I'm more reserved at first, but I open up quickly.</w:t>
             </w:r>
@@ -603,10 +683,10 @@
           <w:tcPr>
             <w:tcW w:type="dxa" w:w="2600"/>
             <w:tcMar>
-              <w:top w:type="dxa" w:w="90"/>
-              <w:left w:type="dxa" w:w="120"/>
-              <w:bottom w:type="dxa" w:w="90"/>
-              <w:right w:type="dxa" w:w="120"/>
+              <w:top w:type="dxa" w:w="70"/>
+              <w:left w:type="dxa" w:w="110"/>
+              <w:bottom w:type="dxa" w:w="70"/>
+              <w:right w:type="dxa" w:w="110"/>
             </w:tcMar>
             <w:vAlign w:val="center"/>
           </w:tcPr>
@@ -619,8 +699,8 @@
                 <w:i w:val="false"/>
                 <w:iCs w:val="false"/>
                 <w:color w:val="444444"/>
-                <w:sz w:val="20"/>
-                <w:szCs w:val="20"/>
+                <w:sz w:val="19"/>
+                <w:szCs w:val="19"/>
               </w:rPr>
               <w:t xml:space="preserve">turning point</w:t>
             </w:r>
@@ -630,24 +710,24 @@
           <w:tcPr>
             <w:tcW w:type="dxa" w:w="2000"/>
             <w:tcMar>
-              <w:top w:type="dxa" w:w="90"/>
-              <w:left w:type="dxa" w:w="120"/>
-              <w:bottom w:type="dxa" w:w="90"/>
-              <w:right w:type="dxa" w:w="120"/>
-            </w:tcMar>
-            <w:vAlign w:val="center"/>
-          </w:tcPr>
-          <w:p>
-            <w:r>
-              <w:rPr>
-                <w:rFonts w:ascii="Calibri" w:cs="Calibri" w:eastAsia="Calibri" w:hAnsi="Calibri"/>
-                <w:b w:val="false"/>
-                <w:bCs w:val="false"/>
-                <w:i w:val="false"/>
-                <w:iCs w:val="false"/>
-                <w:color w:val="444444"/>
-                <w:sz w:val="20"/>
-                <w:szCs w:val="20"/>
+              <w:top w:type="dxa" w:w="70"/>
+              <w:left w:type="dxa" w:w="110"/>
+              <w:bottom w:type="dxa" w:w="70"/>
+              <w:right w:type="dxa" w:w="110"/>
+            </w:tcMar>
+            <w:vAlign w:val="center"/>
+          </w:tcPr>
+          <w:p>
+            <w:r>
+              <w:rPr>
+                <w:rFonts w:ascii="Calibri" w:cs="Calibri" w:eastAsia="Calibri" w:hAnsi="Calibri"/>
+                <w:b w:val="false"/>
+                <w:bCs w:val="false"/>
+                <w:i w:val="false"/>
+                <w:iCs w:val="false"/>
+                <w:color w:val="444444"/>
+                <w:sz w:val="19"/>
+                <w:szCs w:val="19"/>
               </w:rPr>
               <w:t xml:space="preserve">ponto de virada</w:t>
             </w:r>
@@ -657,10 +737,10 @@
           <w:tcPr>
             <w:tcW w:type="dxa" w:w="4600"/>
             <w:tcMar>
-              <w:top w:type="dxa" w:w="90"/>
-              <w:left w:type="dxa" w:w="120"/>
-              <w:bottom w:type="dxa" w:w="90"/>
-              <w:right w:type="dxa" w:w="120"/>
+              <w:top w:type="dxa" w:w="70"/>
+              <w:left w:type="dxa" w:w="110"/>
+              <w:bottom w:type="dxa" w:w="70"/>
+              <w:right w:type="dxa" w:w="110"/>
             </w:tcMar>
             <w:vAlign w:val="center"/>
           </w:tcPr>
@@ -673,8 +753,8 @@
                 <w:i/>
                 <w:iCs/>
                 <w:color w:val="444444"/>
-                <w:sz w:val="20"/>
-                <w:szCs w:val="20"/>
+                <w:sz w:val="19"/>
+                <w:szCs w:val="19"/>
               </w:rPr>
               <w:t xml:space="preserve">Moving abroad was a real turning point in how I see my career.</w:t>
             </w:r>
@@ -686,10 +766,10 @@
           <w:tcPr>
             <w:tcW w:type="dxa" w:w="2600"/>
             <w:tcMar>
-              <w:top w:type="dxa" w:w="90"/>
-              <w:left w:type="dxa" w:w="120"/>
-              <w:bottom w:type="dxa" w:w="90"/>
-              <w:right w:type="dxa" w:w="120"/>
+              <w:top w:type="dxa" w:w="70"/>
+              <w:left w:type="dxa" w:w="110"/>
+              <w:bottom w:type="dxa" w:w="70"/>
+              <w:right w:type="dxa" w:w="110"/>
             </w:tcMar>
             <w:vAlign w:val="center"/>
           </w:tcPr>
@@ -702,8 +782,8 @@
                 <w:i w:val="false"/>
                 <w:iCs w:val="false"/>
                 <w:color w:val="444444"/>
-                <w:sz w:val="20"/>
-                <w:szCs w:val="20"/>
+                <w:sz w:val="19"/>
+                <w:szCs w:val="19"/>
               </w:rPr>
               <w:t xml:space="preserve">to be driven by (something)</w:t>
             </w:r>
@@ -713,24 +793,24 @@
           <w:tcPr>
             <w:tcW w:type="dxa" w:w="2000"/>
             <w:tcMar>
-              <w:top w:type="dxa" w:w="90"/>
-              <w:left w:type="dxa" w:w="120"/>
-              <w:bottom w:type="dxa" w:w="90"/>
-              <w:right w:type="dxa" w:w="120"/>
-            </w:tcMar>
-            <w:vAlign w:val="center"/>
-          </w:tcPr>
-          <w:p>
-            <w:r>
-              <w:rPr>
-                <w:rFonts w:ascii="Calibri" w:cs="Calibri" w:eastAsia="Calibri" w:hAnsi="Calibri"/>
-                <w:b w:val="false"/>
-                <w:bCs w:val="false"/>
-                <w:i w:val="false"/>
-                <w:iCs w:val="false"/>
-                <w:color w:val="444444"/>
-                <w:sz w:val="20"/>
-                <w:szCs w:val="20"/>
+              <w:top w:type="dxa" w:w="70"/>
+              <w:left w:type="dxa" w:w="110"/>
+              <w:bottom w:type="dxa" w:w="70"/>
+              <w:right w:type="dxa" w:w="110"/>
+            </w:tcMar>
+            <w:vAlign w:val="center"/>
+          </w:tcPr>
+          <w:p>
+            <w:r>
+              <w:rPr>
+                <w:rFonts w:ascii="Calibri" w:cs="Calibri" w:eastAsia="Calibri" w:hAnsi="Calibri"/>
+                <w:b w:val="false"/>
+                <w:bCs w:val="false"/>
+                <w:i w:val="false"/>
+                <w:iCs w:val="false"/>
+                <w:color w:val="444444"/>
+                <w:sz w:val="19"/>
+                <w:szCs w:val="19"/>
               </w:rPr>
               <w:t xml:space="preserve">ser motivado por</w:t>
             </w:r>
@@ -740,10 +820,10 @@
           <w:tcPr>
             <w:tcW w:type="dxa" w:w="4600"/>
             <w:tcMar>
-              <w:top w:type="dxa" w:w="90"/>
-              <w:left w:type="dxa" w:w="120"/>
-              <w:bottom w:type="dxa" w:w="90"/>
-              <w:right w:type="dxa" w:w="120"/>
+              <w:top w:type="dxa" w:w="70"/>
+              <w:left w:type="dxa" w:w="110"/>
+              <w:bottom w:type="dxa" w:w="70"/>
+              <w:right w:type="dxa" w:w="110"/>
             </w:tcMar>
             <w:vAlign w:val="center"/>
           </w:tcPr>
@@ -756,10 +836,10 @@
                 <w:i/>
                 <w:iCs/>
                 <w:color w:val="444444"/>
-                <w:sz w:val="20"/>
-                <w:szCs w:val="20"/>
-              </w:rPr>
-              <w:t xml:space="preserve">I'm mostly driven by learning — I get bored if I'm not being challenged.</w:t>
+                <w:sz w:val="19"/>
+                <w:szCs w:val="19"/>
+              </w:rPr>
+              <w:t xml:space="preserve">I'm mostly driven by learning, I get bored if I'm not being challenged.</w:t>
             </w:r>
           </w:p>
         </w:tc>
@@ -769,10 +849,10 @@
           <w:tcPr>
             <w:tcW w:type="dxa" w:w="2600"/>
             <w:tcMar>
-              <w:top w:type="dxa" w:w="90"/>
-              <w:left w:type="dxa" w:w="120"/>
-              <w:bottom w:type="dxa" w:w="90"/>
-              <w:right w:type="dxa" w:w="120"/>
+              <w:top w:type="dxa" w:w="70"/>
+              <w:left w:type="dxa" w:w="110"/>
+              <w:bottom w:type="dxa" w:w="70"/>
+              <w:right w:type="dxa" w:w="110"/>
             </w:tcMar>
             <w:vAlign w:val="center"/>
           </w:tcPr>
@@ -785,8 +865,8 @@
                 <w:i w:val="false"/>
                 <w:iCs w:val="false"/>
                 <w:color w:val="444444"/>
-                <w:sz w:val="20"/>
-                <w:szCs w:val="20"/>
+                <w:sz w:val="19"/>
+                <w:szCs w:val="19"/>
               </w:rPr>
               <w:t xml:space="preserve">resilient</w:t>
             </w:r>
@@ -796,24 +876,24 @@
           <w:tcPr>
             <w:tcW w:type="dxa" w:w="2000"/>
             <w:tcMar>
-              <w:top w:type="dxa" w:w="90"/>
-              <w:left w:type="dxa" w:w="120"/>
-              <w:bottom w:type="dxa" w:w="90"/>
-              <w:right w:type="dxa" w:w="120"/>
-            </w:tcMar>
-            <w:vAlign w:val="center"/>
-          </w:tcPr>
-          <w:p>
-            <w:r>
-              <w:rPr>
-                <w:rFonts w:ascii="Calibri" w:cs="Calibri" w:eastAsia="Calibri" w:hAnsi="Calibri"/>
-                <w:b w:val="false"/>
-                <w:bCs w:val="false"/>
-                <w:i w:val="false"/>
-                <w:iCs w:val="false"/>
-                <w:color w:val="444444"/>
-                <w:sz w:val="20"/>
-                <w:szCs w:val="20"/>
+              <w:top w:type="dxa" w:w="70"/>
+              <w:left w:type="dxa" w:w="110"/>
+              <w:bottom w:type="dxa" w:w="70"/>
+              <w:right w:type="dxa" w:w="110"/>
+            </w:tcMar>
+            <w:vAlign w:val="center"/>
+          </w:tcPr>
+          <w:p>
+            <w:r>
+              <w:rPr>
+                <w:rFonts w:ascii="Calibri" w:cs="Calibri" w:eastAsia="Calibri" w:hAnsi="Calibri"/>
+                <w:b w:val="false"/>
+                <w:bCs w:val="false"/>
+                <w:i w:val="false"/>
+                <w:iCs w:val="false"/>
+                <w:color w:val="444444"/>
+                <w:sz w:val="19"/>
+                <w:szCs w:val="19"/>
               </w:rPr>
               <w:t xml:space="preserve">resiliente</w:t>
             </w:r>
@@ -823,10 +903,10 @@
           <w:tcPr>
             <w:tcW w:type="dxa" w:w="4600"/>
             <w:tcMar>
-              <w:top w:type="dxa" w:w="90"/>
-              <w:left w:type="dxa" w:w="120"/>
-              <w:bottom w:type="dxa" w:w="90"/>
-              <w:right w:type="dxa" w:w="120"/>
+              <w:top w:type="dxa" w:w="70"/>
+              <w:left w:type="dxa" w:w="110"/>
+              <w:bottom w:type="dxa" w:w="70"/>
+              <w:right w:type="dxa" w:w="110"/>
             </w:tcMar>
             <w:vAlign w:val="center"/>
           </w:tcPr>
@@ -839,8 +919,8 @@
                 <w:i/>
                 <w:iCs/>
                 <w:color w:val="444444"/>
-                <w:sz w:val="20"/>
-                <w:szCs w:val="20"/>
+                <w:sz w:val="19"/>
+                <w:szCs w:val="19"/>
               </w:rPr>
               <w:t xml:space="preserve">If there's one word to describe me, it's resilient.</w:t>
             </w:r>
@@ -852,10 +932,10 @@
           <w:tcPr>
             <w:tcW w:type="dxa" w:w="2600"/>
             <w:tcMar>
-              <w:top w:type="dxa" w:w="90"/>
-              <w:left w:type="dxa" w:w="120"/>
-              <w:bottom w:type="dxa" w:w="90"/>
-              <w:right w:type="dxa" w:w="120"/>
+              <w:top w:type="dxa" w:w="70"/>
+              <w:left w:type="dxa" w:w="110"/>
+              <w:bottom w:type="dxa" w:w="70"/>
+              <w:right w:type="dxa" w:w="110"/>
             </w:tcMar>
             <w:vAlign w:val="center"/>
           </w:tcPr>
@@ -868,8 +948,8 @@
                 <w:i w:val="false"/>
                 <w:iCs w:val="false"/>
                 <w:color w:val="444444"/>
-                <w:sz w:val="20"/>
-                <w:szCs w:val="20"/>
+                <w:sz w:val="19"/>
+                <w:szCs w:val="19"/>
               </w:rPr>
               <w:t xml:space="preserve">milestone</w:t>
             </w:r>
@@ -879,24 +959,24 @@
           <w:tcPr>
             <w:tcW w:type="dxa" w:w="2000"/>
             <w:tcMar>
-              <w:top w:type="dxa" w:w="90"/>
-              <w:left w:type="dxa" w:w="120"/>
-              <w:bottom w:type="dxa" w:w="90"/>
-              <w:right w:type="dxa" w:w="120"/>
-            </w:tcMar>
-            <w:vAlign w:val="center"/>
-          </w:tcPr>
-          <w:p>
-            <w:r>
-              <w:rPr>
-                <w:rFonts w:ascii="Calibri" w:cs="Calibri" w:eastAsia="Calibri" w:hAnsi="Calibri"/>
-                <w:b w:val="false"/>
-                <w:bCs w:val="false"/>
-                <w:i w:val="false"/>
-                <w:iCs w:val="false"/>
-                <w:color w:val="444444"/>
-                <w:sz w:val="20"/>
-                <w:szCs w:val="20"/>
+              <w:top w:type="dxa" w:w="70"/>
+              <w:left w:type="dxa" w:w="110"/>
+              <w:bottom w:type="dxa" w:w="70"/>
+              <w:right w:type="dxa" w:w="110"/>
+            </w:tcMar>
+            <w:vAlign w:val="center"/>
+          </w:tcPr>
+          <w:p>
+            <w:r>
+              <w:rPr>
+                <w:rFonts w:ascii="Calibri" w:cs="Calibri" w:eastAsia="Calibri" w:hAnsi="Calibri"/>
+                <w:b w:val="false"/>
+                <w:bCs w:val="false"/>
+                <w:i w:val="false"/>
+                <w:iCs w:val="false"/>
+                <w:color w:val="444444"/>
+                <w:sz w:val="19"/>
+                <w:szCs w:val="19"/>
               </w:rPr>
               <w:t xml:space="preserve">marco / conquista importante</w:t>
             </w:r>
@@ -906,10 +986,10 @@
           <w:tcPr>
             <w:tcW w:type="dxa" w:w="4600"/>
             <w:tcMar>
-              <w:top w:type="dxa" w:w="90"/>
-              <w:left w:type="dxa" w:w="120"/>
-              <w:bottom w:type="dxa" w:w="90"/>
-              <w:right w:type="dxa" w:w="120"/>
+              <w:top w:type="dxa" w:w="70"/>
+              <w:left w:type="dxa" w:w="110"/>
+              <w:bottom w:type="dxa" w:w="70"/>
+              <w:right w:type="dxa" w:w="110"/>
             </w:tcMar>
             <w:vAlign w:val="center"/>
           </w:tcPr>
@@ -922,8 +1002,8 @@
                 <w:i/>
                 <w:iCs/>
                 <w:color w:val="444444"/>
-                <w:sz w:val="20"/>
-                <w:szCs w:val="20"/>
+                <w:sz w:val="19"/>
+                <w:szCs w:val="19"/>
               </w:rPr>
               <w:t xml:space="preserve">Getting my first leadership role was a huge milestone for me.</w:t>
             </w:r>
@@ -935,10 +1015,10 @@
           <w:tcPr>
             <w:tcW w:type="dxa" w:w="2600"/>
             <w:tcMar>
-              <w:top w:type="dxa" w:w="90"/>
-              <w:left w:type="dxa" w:w="120"/>
-              <w:bottom w:type="dxa" w:w="90"/>
-              <w:right w:type="dxa" w:w="120"/>
+              <w:top w:type="dxa" w:w="70"/>
+              <w:left w:type="dxa" w:w="110"/>
+              <w:bottom w:type="dxa" w:w="70"/>
+              <w:right w:type="dxa" w:w="110"/>
             </w:tcMar>
             <w:vAlign w:val="center"/>
           </w:tcPr>
@@ -951,8 +1031,8 @@
                 <w:i w:val="false"/>
                 <w:iCs w:val="false"/>
                 <w:color w:val="444444"/>
-                <w:sz w:val="20"/>
-                <w:szCs w:val="20"/>
+                <w:sz w:val="19"/>
+                <w:szCs w:val="19"/>
               </w:rPr>
               <w:t xml:space="preserve">to take pride in</w:t>
             </w:r>
@@ -962,24 +1042,24 @@
           <w:tcPr>
             <w:tcW w:type="dxa" w:w="2000"/>
             <w:tcMar>
-              <w:top w:type="dxa" w:w="90"/>
-              <w:left w:type="dxa" w:w="120"/>
-              <w:bottom w:type="dxa" w:w="90"/>
-              <w:right w:type="dxa" w:w="120"/>
-            </w:tcMar>
-            <w:vAlign w:val="center"/>
-          </w:tcPr>
-          <w:p>
-            <w:r>
-              <w:rPr>
-                <w:rFonts w:ascii="Calibri" w:cs="Calibri" w:eastAsia="Calibri" w:hAnsi="Calibri"/>
-                <w:b w:val="false"/>
-                <w:bCs w:val="false"/>
-                <w:i w:val="false"/>
-                <w:iCs w:val="false"/>
-                <w:color w:val="444444"/>
-                <w:sz w:val="20"/>
-                <w:szCs w:val="20"/>
+              <w:top w:type="dxa" w:w="70"/>
+              <w:left w:type="dxa" w:w="110"/>
+              <w:bottom w:type="dxa" w:w="70"/>
+              <w:right w:type="dxa" w:w="110"/>
+            </w:tcMar>
+            <w:vAlign w:val="center"/>
+          </w:tcPr>
+          <w:p>
+            <w:r>
+              <w:rPr>
+                <w:rFonts w:ascii="Calibri" w:cs="Calibri" w:eastAsia="Calibri" w:hAnsi="Calibri"/>
+                <w:b w:val="false"/>
+                <w:bCs w:val="false"/>
+                <w:i w:val="false"/>
+                <w:iCs w:val="false"/>
+                <w:color w:val="444444"/>
+                <w:sz w:val="19"/>
+                <w:szCs w:val="19"/>
               </w:rPr>
               <w:t xml:space="preserve">ter orgulho de</w:t>
             </w:r>
@@ -989,10 +1069,10 @@
           <w:tcPr>
             <w:tcW w:type="dxa" w:w="4600"/>
             <w:tcMar>
-              <w:top w:type="dxa" w:w="90"/>
-              <w:left w:type="dxa" w:w="120"/>
-              <w:bottom w:type="dxa" w:w="90"/>
-              <w:right w:type="dxa" w:w="120"/>
+              <w:top w:type="dxa" w:w="70"/>
+              <w:left w:type="dxa" w:w="110"/>
+              <w:bottom w:type="dxa" w:w="70"/>
+              <w:right w:type="dxa" w:w="110"/>
             </w:tcMar>
             <w:vAlign w:val="center"/>
           </w:tcPr>
@@ -1005,8 +1085,8 @@
                 <w:i/>
                 <w:iCs/>
                 <w:color w:val="444444"/>
-                <w:sz w:val="20"/>
-                <w:szCs w:val="20"/>
+                <w:sz w:val="19"/>
+                <w:szCs w:val="19"/>
               </w:rPr>
               <w:t xml:space="preserve">I take a lot of pride in how far my team has come this year.</w:t>
             </w:r>
@@ -1018,10 +1098,10 @@
           <w:tcPr>
             <w:tcW w:type="dxa" w:w="2600"/>
             <w:tcMar>
-              <w:top w:type="dxa" w:w="90"/>
-              <w:left w:type="dxa" w:w="120"/>
-              <w:bottom w:type="dxa" w:w="90"/>
-              <w:right w:type="dxa" w:w="120"/>
+              <w:top w:type="dxa" w:w="70"/>
+              <w:left w:type="dxa" w:w="110"/>
+              <w:bottom w:type="dxa" w:w="70"/>
+              <w:right w:type="dxa" w:w="110"/>
             </w:tcMar>
             <w:vAlign w:val="center"/>
           </w:tcPr>
@@ -1034,8 +1114,8 @@
                 <w:i w:val="false"/>
                 <w:iCs w:val="false"/>
                 <w:color w:val="444444"/>
-                <w:sz w:val="20"/>
-                <w:szCs w:val="20"/>
+                <w:sz w:val="19"/>
+                <w:szCs w:val="19"/>
               </w:rPr>
               <w:t xml:space="preserve">work in progress</w:t>
             </w:r>
@@ -1045,24 +1125,24 @@
           <w:tcPr>
             <w:tcW w:type="dxa" w:w="2000"/>
             <w:tcMar>
-              <w:top w:type="dxa" w:w="90"/>
-              <w:left w:type="dxa" w:w="120"/>
-              <w:bottom w:type="dxa" w:w="90"/>
-              <w:right w:type="dxa" w:w="120"/>
-            </w:tcMar>
-            <w:vAlign w:val="center"/>
-          </w:tcPr>
-          <w:p>
-            <w:r>
-              <w:rPr>
-                <w:rFonts w:ascii="Calibri" w:cs="Calibri" w:eastAsia="Calibri" w:hAnsi="Calibri"/>
-                <w:b w:val="false"/>
-                <w:bCs w:val="false"/>
-                <w:i w:val="false"/>
-                <w:iCs w:val="false"/>
-                <w:color w:val="444444"/>
-                <w:sz w:val="20"/>
-                <w:szCs w:val="20"/>
+              <w:top w:type="dxa" w:w="70"/>
+              <w:left w:type="dxa" w:w="110"/>
+              <w:bottom w:type="dxa" w:w="70"/>
+              <w:right w:type="dxa" w:w="110"/>
+            </w:tcMar>
+            <w:vAlign w:val="center"/>
+          </w:tcPr>
+          <w:p>
+            <w:r>
+              <w:rPr>
+                <w:rFonts w:ascii="Calibri" w:cs="Calibri" w:eastAsia="Calibri" w:hAnsi="Calibri"/>
+                <w:b w:val="false"/>
+                <w:bCs w:val="false"/>
+                <w:i w:val="false"/>
+                <w:iCs w:val="false"/>
+                <w:color w:val="444444"/>
+                <w:sz w:val="19"/>
+                <w:szCs w:val="19"/>
               </w:rPr>
               <w:t xml:space="preserve">trabalho em andamento (fig.)</w:t>
             </w:r>
@@ -1072,10 +1152,10 @@
           <w:tcPr>
             <w:tcW w:type="dxa" w:w="4600"/>
             <w:tcMar>
-              <w:top w:type="dxa" w:w="90"/>
-              <w:left w:type="dxa" w:w="120"/>
-              <w:bottom w:type="dxa" w:w="90"/>
-              <w:right w:type="dxa" w:w="120"/>
+              <w:top w:type="dxa" w:w="70"/>
+              <w:left w:type="dxa" w:w="110"/>
+              <w:bottom w:type="dxa" w:w="70"/>
+              <w:right w:type="dxa" w:w="110"/>
             </w:tcMar>
             <w:vAlign w:val="center"/>
           </w:tcPr>
@@ -1088,8 +1168,8 @@
                 <w:i/>
                 <w:iCs/>
                 <w:color w:val="444444"/>
-                <w:sz w:val="20"/>
-                <w:szCs w:val="20"/>
+                <w:sz w:val="19"/>
+                <w:szCs w:val="19"/>
               </w:rPr>
               <w:t xml:space="preserve">I'm still a work in progress when it comes to public speaking.</w:t>
             </w:r>
@@ -1101,10 +1181,10 @@
           <w:tcPr>
             <w:tcW w:type="dxa" w:w="2600"/>
             <w:tcMar>
-              <w:top w:type="dxa" w:w="90"/>
-              <w:left w:type="dxa" w:w="120"/>
-              <w:bottom w:type="dxa" w:w="90"/>
-              <w:right w:type="dxa" w:w="120"/>
+              <w:top w:type="dxa" w:w="70"/>
+              <w:left w:type="dxa" w:w="110"/>
+              <w:bottom w:type="dxa" w:w="70"/>
+              <w:right w:type="dxa" w:w="110"/>
             </w:tcMar>
             <w:vAlign w:val="center"/>
           </w:tcPr>
@@ -1117,8 +1197,8 @@
                 <w:i w:val="false"/>
                 <w:iCs w:val="false"/>
                 <w:color w:val="444444"/>
-                <w:sz w:val="20"/>
-                <w:szCs w:val="20"/>
+                <w:sz w:val="19"/>
+                <w:szCs w:val="19"/>
               </w:rPr>
               <w:t xml:space="preserve">curious</w:t>
             </w:r>
@@ -1128,24 +1208,24 @@
           <w:tcPr>
             <w:tcW w:type="dxa" w:w="2000"/>
             <w:tcMar>
-              <w:top w:type="dxa" w:w="90"/>
-              <w:left w:type="dxa" w:w="120"/>
-              <w:bottom w:type="dxa" w:w="90"/>
-              <w:right w:type="dxa" w:w="120"/>
-            </w:tcMar>
-            <w:vAlign w:val="center"/>
-          </w:tcPr>
-          <w:p>
-            <w:r>
-              <w:rPr>
-                <w:rFonts w:ascii="Calibri" w:cs="Calibri" w:eastAsia="Calibri" w:hAnsi="Calibri"/>
-                <w:b w:val="false"/>
-                <w:bCs w:val="false"/>
-                <w:i w:val="false"/>
-                <w:iCs w:val="false"/>
-                <w:color w:val="444444"/>
-                <w:sz w:val="20"/>
-                <w:szCs w:val="20"/>
+              <w:top w:type="dxa" w:w="70"/>
+              <w:left w:type="dxa" w:w="110"/>
+              <w:bottom w:type="dxa" w:w="70"/>
+              <w:right w:type="dxa" w:w="110"/>
+            </w:tcMar>
+            <w:vAlign w:val="center"/>
+          </w:tcPr>
+          <w:p>
+            <w:r>
+              <w:rPr>
+                <w:rFonts w:ascii="Calibri" w:cs="Calibri" w:eastAsia="Calibri" w:hAnsi="Calibri"/>
+                <w:b w:val="false"/>
+                <w:bCs w:val="false"/>
+                <w:i w:val="false"/>
+                <w:iCs w:val="false"/>
+                <w:color w:val="444444"/>
+                <w:sz w:val="19"/>
+                <w:szCs w:val="19"/>
               </w:rPr>
               <w:t xml:space="preserve">curioso(a)</w:t>
             </w:r>
@@ -1155,10 +1235,10 @@
           <w:tcPr>
             <w:tcW w:type="dxa" w:w="4600"/>
             <w:tcMar>
-              <w:top w:type="dxa" w:w="90"/>
-              <w:left w:type="dxa" w:w="120"/>
-              <w:bottom w:type="dxa" w:w="90"/>
-              <w:right w:type="dxa" w:w="120"/>
+              <w:top w:type="dxa" w:w="70"/>
+              <w:left w:type="dxa" w:w="110"/>
+              <w:bottom w:type="dxa" w:w="70"/>
+              <w:right w:type="dxa" w:w="110"/>
             </w:tcMar>
             <w:vAlign w:val="center"/>
           </w:tcPr>
@@ -1171,10 +1251,10 @@
                 <w:i/>
                 <w:iCs/>
                 <w:color w:val="444444"/>
-                <w:sz w:val="20"/>
-                <w:szCs w:val="20"/>
-              </w:rPr>
-              <w:t xml:space="preserve">I'm naturally curious — I ask a lot of "why" questions.</w:t>
+                <w:sz w:val="19"/>
+                <w:szCs w:val="19"/>
+              </w:rPr>
+              <w:t xml:space="preserve">I'm naturally curious, I ask a lot of "why" questions.</w:t>
             </w:r>
           </w:p>
         </w:tc>
@@ -1184,10 +1264,10 @@
           <w:tcPr>
             <w:tcW w:type="dxa" w:w="2600"/>
             <w:tcMar>
-              <w:top w:type="dxa" w:w="90"/>
-              <w:left w:type="dxa" w:w="120"/>
-              <w:bottom w:type="dxa" w:w="90"/>
-              <w:right w:type="dxa" w:w="120"/>
+              <w:top w:type="dxa" w:w="70"/>
+              <w:left w:type="dxa" w:w="110"/>
+              <w:bottom w:type="dxa" w:w="70"/>
+              <w:right w:type="dxa" w:w="110"/>
             </w:tcMar>
             <w:vAlign w:val="center"/>
           </w:tcPr>
@@ -1200,8 +1280,8 @@
                 <w:i w:val="false"/>
                 <w:iCs w:val="false"/>
                 <w:color w:val="444444"/>
-                <w:sz w:val="20"/>
-                <w:szCs w:val="20"/>
+                <w:sz w:val="19"/>
+                <w:szCs w:val="19"/>
               </w:rPr>
               <w:t xml:space="preserve">to identify as</w:t>
             </w:r>
@@ -1211,24 +1291,24 @@
           <w:tcPr>
             <w:tcW w:type="dxa" w:w="2000"/>
             <w:tcMar>
-              <w:top w:type="dxa" w:w="90"/>
-              <w:left w:type="dxa" w:w="120"/>
-              <w:bottom w:type="dxa" w:w="90"/>
-              <w:right w:type="dxa" w:w="120"/>
-            </w:tcMar>
-            <w:vAlign w:val="center"/>
-          </w:tcPr>
-          <w:p>
-            <w:r>
-              <w:rPr>
-                <w:rFonts w:ascii="Calibri" w:cs="Calibri" w:eastAsia="Calibri" w:hAnsi="Calibri"/>
-                <w:b w:val="false"/>
-                <w:bCs w:val="false"/>
-                <w:i w:val="false"/>
-                <w:iCs w:val="false"/>
-                <w:color w:val="444444"/>
-                <w:sz w:val="20"/>
-                <w:szCs w:val="20"/>
+              <w:top w:type="dxa" w:w="70"/>
+              <w:left w:type="dxa" w:w="110"/>
+              <w:bottom w:type="dxa" w:w="70"/>
+              <w:right w:type="dxa" w:w="110"/>
+            </w:tcMar>
+            <w:vAlign w:val="center"/>
+          </w:tcPr>
+          <w:p>
+            <w:r>
+              <w:rPr>
+                <w:rFonts w:ascii="Calibri" w:cs="Calibri" w:eastAsia="Calibri" w:hAnsi="Calibri"/>
+                <w:b w:val="false"/>
+                <w:bCs w:val="false"/>
+                <w:i w:val="false"/>
+                <w:iCs w:val="false"/>
+                <w:color w:val="444444"/>
+                <w:sz w:val="19"/>
+                <w:szCs w:val="19"/>
               </w:rPr>
               <w:t xml:space="preserve">se identificar como</w:t>
             </w:r>
@@ -1238,10 +1318,10 @@
           <w:tcPr>
             <w:tcW w:type="dxa" w:w="4600"/>
             <w:tcMar>
-              <w:top w:type="dxa" w:w="90"/>
-              <w:left w:type="dxa" w:w="120"/>
-              <w:bottom w:type="dxa" w:w="90"/>
-              <w:right w:type="dxa" w:w="120"/>
+              <w:top w:type="dxa" w:w="70"/>
+              <w:left w:type="dxa" w:w="110"/>
+              <w:bottom w:type="dxa" w:w="70"/>
+              <w:right w:type="dxa" w:w="110"/>
             </w:tcMar>
             <w:vAlign w:val="center"/>
           </w:tcPr>
@@ -1254,8 +1334,8 @@
                 <w:i/>
                 <w:iCs/>
                 <w:color w:val="444444"/>
-                <w:sz w:val="20"/>
-                <w:szCs w:val="20"/>
+                <w:sz w:val="19"/>
+                <w:szCs w:val="19"/>
               </w:rPr>
               <w:t xml:space="preserve">I identify more as a builder than a manager, if that makes sense.</w:t>
             </w:r>
@@ -1266,7 +1346,7 @@
     <w:p>
       <w:pPr>
         <w:shd w:fill="178A6D" w:val="clear"/>
-        <w:spacing w:after="150" w:before="500"/>
+        <w:spacing w:after="110" w:before="340"/>
       </w:pPr>
       <w:r>
         <w:rPr>
@@ -1274,8 +1354,8 @@
           <w:b/>
           <w:bCs/>
           <w:color w:val="FFFFFF"/>
-          <w:sz w:val="20"/>
-          <w:szCs w:val="20"/>
+          <w:sz w:val="18"/>
+          <w:szCs w:val="18"/>
         </w:rPr>
         <w:t xml:space="preserve">  ETAPA 2  </w:t>
       </w:r>
@@ -1285,10 +1365,22 @@
           <w:b/>
           <w:bCs/>
           <w:color w:val="FFFFFF"/>
-          <w:sz w:val="24"/>
-          <w:szCs w:val="24"/>
+          <w:sz w:val="23"/>
+          <w:szCs w:val="23"/>
         </w:rPr>
         <w:t xml:space="preserve">   Leitura com Orientação de Estudo</w:t>
+      </w:r>
+      <w:r>
+        <w:rPr>
+          <w:rFonts w:ascii="Calibri" w:cs="Calibri" w:eastAsia="Calibri" w:hAnsi="Calibri"/>
+          <w:i/>
+          <w:iCs/>
+          <w:color w:val="D8E7F2"/>
+          <w:sz w:val="17"/>
+          <w:szCs w:val="17"/>
+        </w:rPr>
+        <w:br/>
+        <w:t xml:space="preserve">   Guided Reading</w:t>
       </w:r>
     </w:p>
     <w:tbl>
@@ -1311,15 +1403,15 @@
           <w:tcPr>
             <w:shd w:fill="E9F5F1" w:val="clear"/>
             <w:tcMar>
-              <w:top w:type="dxa" w:w="150"/>
-              <w:left w:type="dxa" w:w="200"/>
-              <w:bottom w:type="dxa" w:w="150"/>
-              <w:right w:type="dxa" w:w="200"/>
+              <w:top w:type="dxa" w:w="110"/>
+              <w:left w:type="dxa" w:w="180"/>
+              <w:bottom w:type="dxa" w:w="110"/>
+              <w:right w:type="dxa" w:w="180"/>
             </w:tcMar>
           </w:tcPr>
           <w:p>
             <w:pPr>
-              <w:spacing w:after="80"/>
+              <w:spacing w:after="60"/>
             </w:pPr>
             <w:r>
               <w:rPr>
@@ -1327,50 +1419,50 @@
                 <w:b/>
                 <w:bCs/>
                 <w:color w:val="178A6D"/>
-                <w:sz w:val="21"/>
-                <w:szCs w:val="21"/>
+                <w:sz w:val="20"/>
+                <w:szCs w:val="20"/>
               </w:rPr>
               <w:t xml:space="preserve">Como ler este texto</w:t>
             </w:r>
           </w:p>
           <w:p>
             <w:pPr>
-              <w:spacing w:after="60"/>
+              <w:spacing w:after="40"/>
             </w:pPr>
             <w:r>
               <w:rPr>
                 <w:rFonts w:ascii="Calibri" w:cs="Calibri" w:eastAsia="Calibri" w:hAnsi="Calibri"/>
                 <w:color w:val="444444"/>
-                <w:sz w:val="21"/>
-                <w:szCs w:val="21"/>
-              </w:rPr>
-              <w:t xml:space="preserve">1) Leia uma vez, rápido, só para captar a ideia geral — sem parar no que não entender.</w:t>
+                <w:sz w:val="20"/>
+                <w:szCs w:val="20"/>
+              </w:rPr>
+              <w:t xml:space="preserve">1) Leia uma vez, rápido, só para captar a ideia geral, sem parar no que não entender.</w:t>
             </w:r>
           </w:p>
           <w:p>
             <w:pPr>
-              <w:spacing w:after="60"/>
+              <w:spacing w:after="40"/>
             </w:pPr>
             <w:r>
               <w:rPr>
                 <w:rFonts w:ascii="Calibri" w:cs="Calibri" w:eastAsia="Calibri" w:hAnsi="Calibri"/>
                 <w:color w:val="444444"/>
-                <w:sz w:val="21"/>
-                <w:szCs w:val="21"/>
+                <w:sz w:val="20"/>
+                <w:szCs w:val="20"/>
               </w:rPr>
               <w:t xml:space="preserve">2) Leia de novo e grife toda expressão da Etapa 1 que aparecer no texto.</w:t>
             </w:r>
           </w:p>
           <w:p>
             <w:pPr>
-              <w:spacing w:after="60"/>
+              <w:spacing w:after="40"/>
             </w:pPr>
             <w:r>
               <w:rPr>
                 <w:rFonts w:ascii="Calibri" w:cs="Calibri" w:eastAsia="Calibri" w:hAnsi="Calibri"/>
                 <w:color w:val="444444"/>
-                <w:sz w:val="21"/>
-                <w:szCs w:val="21"/>
+                <w:sz w:val="20"/>
+                <w:szCs w:val="20"/>
               </w:rPr>
               <w:t xml:space="preserve">3) Releia em voz alta, como se você estivesse contando essa história sobre você mesmo.</w:t>
             </w:r>
@@ -1380,7 +1472,7 @@
     </w:tbl>
     <w:p>
       <w:pPr>
-        <w:spacing w:after="160" w:line="300"/>
+        <w:spacing w:after="120" w:line="276"/>
       </w:pPr>
       <w:r>
         <w:rPr>
@@ -1390,15 +1482,15 @@
           <w:i w:val="false"/>
           <w:iCs w:val="false"/>
           <w:color w:val="444444"/>
-          <w:sz w:val="22"/>
-          <w:szCs w:val="22"/>
+          <w:sz w:val="21"/>
+          <w:szCs w:val="21"/>
         </w:rPr>
         <w:t xml:space="preserve">"How Do You Actually Answer "Tell Me About Yourself"?"</w:t>
       </w:r>
     </w:p>
     <w:p>
       <w:pPr>
-        <w:spacing w:after="160" w:line="300"/>
+        <w:spacing w:after="120" w:line="276"/>
       </w:pPr>
       <w:r>
         <w:rPr>
@@ -1408,15 +1500,15 @@
           <w:i w:val="false"/>
           <w:iCs w:val="false"/>
           <w:color w:val="444444"/>
-          <w:sz w:val="22"/>
-          <w:szCs w:val="22"/>
-        </w:rPr>
-        <w:t xml:space="preserve">Most people answer this question the same way: name, job title, maybe how long they've been doing it. It's not wrong — it's just forgettable. The people who stand out in interviews, in networking events, in any first conversation, do one thing differently: they connect a fact about themselves to a reason it matters.</w:t>
-      </w:r>
-    </w:p>
-    <w:p>
-      <w:pPr>
-        <w:spacing w:after="160" w:line="300"/>
+          <w:sz w:val="21"/>
+          <w:szCs w:val="21"/>
+        </w:rPr>
+        <w:t xml:space="preserve">Most people answer this question the same way: name, job title, maybe how long they've been doing it. It's not wrong, it's just forgettable. The people who stand out in interviews, in networking events, in any first conversation, do one thing differently: they connect a fact about themselves to a reason it matters.</w:t>
+      </w:r>
+    </w:p>
+    <w:p>
+      <w:pPr>
+        <w:spacing w:after="120" w:line="276"/>
       </w:pPr>
       <w:r>
         <w:rPr>
@@ -1426,15 +1518,15 @@
           <w:i w:val="false"/>
           <w:iCs w:val="false"/>
           <w:color w:val="444444"/>
-          <w:sz w:val="22"/>
-          <w:szCs w:val="22"/>
-        </w:rPr>
-        <w:t xml:space="preserve">Instead of "I've worked in marketing for six years," they say something closer to: "My background is in marketing, but the turning point for me was leading a small team through a product launch — that's when I realized I was more driven by people than by campaigns." Same information. Completely different impression.</w:t>
-      </w:r>
-    </w:p>
-    <w:p>
-      <w:pPr>
-        <w:spacing w:after="160" w:line="300"/>
+          <w:sz w:val="21"/>
+          <w:szCs w:val="21"/>
+        </w:rPr>
+        <w:t xml:space="preserve">Instead of "I've worked in marketing for six years," they say something closer to: "My background is in marketing, but the turning point for me was leading a small team through a product launch, that's when I realized I was more driven by people than by campaigns." Same information. Completely different impression.</w:t>
+      </w:r>
+    </w:p>
+    <w:p>
+      <w:pPr>
+        <w:spacing w:after="120" w:line="276"/>
       </w:pPr>
       <w:r>
         <w:rPr>
@@ -1444,8 +1536,8 @@
           <w:i w:val="false"/>
           <w:iCs w:val="false"/>
           <w:color w:val="444444"/>
-          <w:sz w:val="22"/>
-          <w:szCs w:val="22"/>
+          <w:sz w:val="21"/>
+          <w:szCs w:val="21"/>
         </w:rPr>
         <w:t xml:space="preserve">This isn't about memorizing a perfect script. It's about knowing three or four things: where you come from professionally, a milestone that shaped how you work, a trait you'd genuinely use to describe yourself, and something you're still working on. Once you have those four anchors, you can answer almost any version of "tell me about yourself."</w:t>
       </w:r>
@@ -1453,7 +1545,7 @@
     <w:p>
       <w:pPr>
         <w:shd w:fill="7D5BA6" w:val="clear"/>
-        <w:spacing w:after="150" w:before="500"/>
+        <w:spacing w:after="110" w:before="340"/>
       </w:pPr>
       <w:r>
         <w:rPr>
@@ -1461,8 +1553,8 @@
           <w:b/>
           <w:bCs/>
           <w:color w:val="FFFFFF"/>
-          <w:sz w:val="20"/>
-          <w:szCs w:val="20"/>
+          <w:sz w:val="18"/>
+          <w:szCs w:val="18"/>
         </w:rPr>
         <w:t xml:space="preserve">  ETAPA 3  </w:t>
       </w:r>
@@ -1472,15 +1564,27 @@
           <w:b/>
           <w:bCs/>
           <w:color w:val="FFFFFF"/>
-          <w:sz w:val="24"/>
-          <w:szCs w:val="24"/>
+          <w:sz w:val="23"/>
+          <w:szCs w:val="23"/>
         </w:rPr>
         <w:t xml:space="preserve">   Listening com Suporte em Áudio e Vídeo</w:t>
       </w:r>
-    </w:p>
-    <w:p>
-      <w:pPr>
-        <w:spacing w:after="160" w:line="300"/>
+      <w:r>
+        <w:rPr>
+          <w:rFonts w:ascii="Calibri" w:cs="Calibri" w:eastAsia="Calibri" w:hAnsi="Calibri"/>
+          <w:i/>
+          <w:iCs/>
+          <w:color w:val="D8E7F2"/>
+          <w:sz w:val="17"/>
+          <w:szCs w:val="17"/>
+        </w:rPr>
+        <w:br/>
+        <w:t xml:space="preserve">   Guided Listening</w:t>
+      </w:r>
+    </w:p>
+    <w:p>
+      <w:pPr>
+        <w:spacing w:after="120" w:line="276"/>
       </w:pPr>
       <w:r>
         <w:rPr>
@@ -1490,8 +1594,8 @@
           <w:i w:val="false"/>
           <w:iCs w:val="false"/>
           <w:color w:val="444444"/>
-          <w:sz w:val="22"/>
-          <w:szCs w:val="22"/>
+          <w:sz w:val="21"/>
+          <w:szCs w:val="21"/>
         </w:rPr>
         <w:t xml:space="preserve">Ouça o áudio deste tema (arquivo disponível para download na plataforma: audio/tema-01-talking-about-yourself.mp3) com o roteiro abaixo. Primeiro sem ler, depois acompanhando o texto.</w:t>
       </w:r>
@@ -1516,15 +1620,15 @@
           <w:tcPr>
             <w:shd w:fill="F1ECF7" w:val="clear"/>
             <w:tcMar>
-              <w:top w:type="dxa" w:w="150"/>
-              <w:left w:type="dxa" w:w="200"/>
-              <w:bottom w:type="dxa" w:w="150"/>
-              <w:right w:type="dxa" w:w="200"/>
+              <w:top w:type="dxa" w:w="110"/>
+              <w:left w:type="dxa" w:w="180"/>
+              <w:bottom w:type="dxa" w:w="110"/>
+              <w:right w:type="dxa" w:w="180"/>
             </w:tcMar>
           </w:tcPr>
           <w:p>
             <w:pPr>
-              <w:spacing w:after="80"/>
+              <w:spacing w:after="60"/>
             </w:pPr>
             <w:r>
               <w:rPr>
@@ -1532,38 +1636,38 @@
                 <w:b/>
                 <w:bCs/>
                 <w:color w:val="7D5BA6"/>
-                <w:sz w:val="21"/>
-                <w:szCs w:val="21"/>
+                <w:sz w:val="20"/>
+                <w:szCs w:val="20"/>
               </w:rPr>
               <w:t xml:space="preserve">Roteiro do áudio (Audio Script)</w:t>
             </w:r>
           </w:p>
           <w:p>
             <w:pPr>
-              <w:spacing w:after="60"/>
+              <w:spacing w:after="40"/>
             </w:pPr>
             <w:r>
               <w:rPr>
                 <w:rFonts w:ascii="Calibri" w:cs="Calibri" w:eastAsia="Calibri" w:hAnsi="Calibri"/>
                 <w:color w:val="444444"/>
-                <w:sz w:val="21"/>
-                <w:szCs w:val="21"/>
-              </w:rPr>
-              <w:t xml:space="preserve">"So, tell me a bit about yourself — what's your background?"</w:t>
+                <w:sz w:val="20"/>
+                <w:szCs w:val="20"/>
+              </w:rPr>
+              <w:t xml:space="preserve">"So, tell me a bit about yourself, what's your background?"</w:t>
             </w:r>
           </w:p>
           <w:p>
             <w:pPr>
-              <w:spacing w:after="60"/>
+              <w:spacing w:after="40"/>
             </w:pPr>
             <w:r>
               <w:rPr>
                 <w:rFonts w:ascii="Calibri" w:cs="Calibri" w:eastAsia="Calibri" w:hAnsi="Calibri"/>
                 <w:color w:val="444444"/>
-                <w:sz w:val="21"/>
-                <w:szCs w:val="21"/>
-              </w:rPr>
-              <w:t xml:space="preserve">"Sure. So my background is actually in engineering, which surprises people once they find out I work in sales now. The turning point was a project where I had to present technical results to non-technical clients — I realized I was more driven by that kind of communication than by the engineering itself. I'd say I'm pretty outgoing, I take pride in building relationships fast, and... I'm still a work in progress when it comes to patience, honestly."</w:t>
+                <w:sz w:val="20"/>
+                <w:szCs w:val="20"/>
+              </w:rPr>
+              <w:t xml:space="preserve">"Sure. So my background is actually in engineering, which surprises people once they find out I work in sales now. The turning point was a project where I had to present technical results to non-technical clients, I realized I was more driven by that kind of communication than by the engineering itself. I'd say I'm pretty outgoing, I take pride in building relationships fast, and... I'm still a work in progress when it comes to patience, honestly."</w:t>
             </w:r>
           </w:p>
         </w:tc>
@@ -1571,7 +1675,7 @@
     </w:tbl>
     <w:p>
       <w:pPr>
-        <w:spacing w:after="160" w:line="300"/>
+        <w:spacing w:after="120" w:line="276"/>
       </w:pPr>
       <w:r>
         <w:rPr>
@@ -1581,8 +1685,8 @@
           <w:i w:val="false"/>
           <w:iCs w:val="false"/>
           <w:color w:val="444444"/>
-          <w:sz w:val="22"/>
-          <w:szCs w:val="22"/>
+          <w:sz w:val="21"/>
+          <w:szCs w:val="21"/>
         </w:rPr>
         <w:t xml:space="preserve">Depois de ouvir duas vezes, responda sem olhar o roteiro: quais das palavras da Etapa 1 você conseguiu identificar de ouvido?</w:t>
       </w:r>
@@ -1590,7 +1694,7 @@
     <w:p>
       <w:pPr>
         <w:shd w:fill="C9762B" w:val="clear"/>
-        <w:spacing w:after="150" w:before="500"/>
+        <w:spacing w:after="110" w:before="340"/>
       </w:pPr>
       <w:r>
         <w:rPr>
@@ -1598,8 +1702,8 @@
           <w:b/>
           <w:bCs/>
           <w:color w:val="FFFFFF"/>
-          <w:sz w:val="20"/>
-          <w:szCs w:val="20"/>
+          <w:sz w:val="18"/>
+          <w:szCs w:val="18"/>
         </w:rPr>
         <w:t xml:space="preserve">  ETAPA 4  </w:t>
       </w:r>
@@ -1609,15 +1713,27 @@
           <w:b/>
           <w:bCs/>
           <w:color w:val="FFFFFF"/>
-          <w:sz w:val="24"/>
-          <w:szCs w:val="24"/>
+          <w:sz w:val="23"/>
+          <w:szCs w:val="23"/>
         </w:rPr>
         <w:t xml:space="preserve">   Writing como Preparação para a Fala</w:t>
       </w:r>
-    </w:p>
-    <w:p>
-      <w:pPr>
-        <w:spacing w:after="160" w:line="300"/>
+      <w:r>
+        <w:rPr>
+          <w:rFonts w:ascii="Calibri" w:cs="Calibri" w:eastAsia="Calibri" w:hAnsi="Calibri"/>
+          <w:i/>
+          <w:iCs/>
+          <w:color w:val="D8E7F2"/>
+          <w:sz w:val="17"/>
+          <w:szCs w:val="17"/>
+        </w:rPr>
+        <w:br/>
+        <w:t xml:space="preserve">   Writing Before Speaking</w:t>
+      </w:r>
+    </w:p>
+    <w:p>
+      <w:pPr>
+        <w:spacing w:after="120" w:line="276"/>
       </w:pPr>
       <w:r>
         <w:rPr>
@@ -1627,10 +1743,10 @@
           <w:i w:val="false"/>
           <w:iCs w:val="false"/>
           <w:color w:val="444444"/>
-          <w:sz w:val="22"/>
-          <w:szCs w:val="22"/>
-        </w:rPr>
-        <w:t xml:space="preserve">Antes de falar, escreva. Use as perguntas abaixo como guia e escreva de 4 a 6 frases — não precisa ser perfeito, precisa existir no papel primeiro.</w:t>
+          <w:sz w:val="21"/>
+          <w:szCs w:val="21"/>
+        </w:rPr>
+        <w:t xml:space="preserve">Antes de falar, escreva. Use as perguntas abaixo como guia e escreva de 4 a 6 frases: não precisa ser perfeito, precisa existir no papel primeiro.</w:t>
       </w:r>
     </w:p>
     <w:p>
@@ -1640,14 +1756,14 @@
           <w:ilvl w:val="0"/>
           <w:numId w:val="2"/>
         </w:numPr>
-        <w:spacing w:after="140" w:line="280"/>
+        <w:spacing w:after="100" w:line="264"/>
       </w:pPr>
       <w:r>
         <w:rPr>
           <w:rFonts w:ascii="Calibri" w:cs="Calibri" w:eastAsia="Calibri" w:hAnsi="Calibri"/>
           <w:color w:val="13293D"/>
-          <w:sz w:val="22"/>
-          <w:szCs w:val="22"/>
+          <w:sz w:val="21"/>
+          <w:szCs w:val="21"/>
         </w:rPr>
         <w:t xml:space="preserve">What's your professional background, in one or two sentences?</w:t>
       </w:r>
@@ -1659,14 +1775,14 @@
           <w:ilvl w:val="0"/>
           <w:numId w:val="2"/>
         </w:numPr>
-        <w:spacing w:after="140" w:line="280"/>
+        <w:spacing w:after="100" w:line="264"/>
       </w:pPr>
       <w:r>
         <w:rPr>
           <w:rFonts w:ascii="Calibri" w:cs="Calibri" w:eastAsia="Calibri" w:hAnsi="Calibri"/>
           <w:color w:val="13293D"/>
-          <w:sz w:val="22"/>
-          <w:szCs w:val="22"/>
+          <w:sz w:val="21"/>
+          <w:szCs w:val="21"/>
         </w:rPr>
         <w:t xml:space="preserve">What was a real turning point in your career or life?</w:t>
       </w:r>
@@ -1678,16 +1794,16 @@
           <w:ilvl w:val="0"/>
           <w:numId w:val="2"/>
         </w:numPr>
-        <w:spacing w:after="140" w:line="280"/>
+        <w:spacing w:after="100" w:line="264"/>
       </w:pPr>
       <w:r>
         <w:rPr>
           <w:rFonts w:ascii="Calibri" w:cs="Calibri" w:eastAsia="Calibri" w:hAnsi="Calibri"/>
           <w:color w:val="13293D"/>
-          <w:sz w:val="22"/>
-          <w:szCs w:val="22"/>
-        </w:rPr>
-        <w:t xml:space="preserve">What's one trait you'd genuinely use to describe yourself — and a small example that proves it?</w:t>
+          <w:sz w:val="21"/>
+          <w:szCs w:val="21"/>
+        </w:rPr>
+        <w:t xml:space="preserve">What's one trait you'd genuinely use to describe yourself, and a small example that proves it?</w:t>
       </w:r>
     </w:p>
     <w:p>
@@ -1697,21 +1813,21 @@
           <w:ilvl w:val="0"/>
           <w:numId w:val="2"/>
         </w:numPr>
-        <w:spacing w:after="140" w:line="280"/>
+        <w:spacing w:after="100" w:line="264"/>
       </w:pPr>
       <w:r>
         <w:rPr>
           <w:rFonts w:ascii="Calibri" w:cs="Calibri" w:eastAsia="Calibri" w:hAnsi="Calibri"/>
           <w:color w:val="13293D"/>
-          <w:sz w:val="22"/>
-          <w:szCs w:val="22"/>
+          <w:sz w:val="21"/>
+          <w:szCs w:val="21"/>
         </w:rPr>
         <w:t xml:space="preserve">What's something you're still working on (a "work in progress")?</w:t>
       </w:r>
     </w:p>
     <w:p>
       <w:pPr>
-        <w:spacing w:after="160" w:line="300"/>
+        <w:spacing w:after="120" w:line="276"/>
       </w:pPr>
       <w:r>
         <w:rPr>
@@ -1721,8 +1837,8 @@
           <w:i w:val="false"/>
           <w:iCs w:val="false"/>
           <w:color w:val="444444"/>
-          <w:sz w:val="22"/>
-          <w:szCs w:val="22"/>
+          <w:sz w:val="21"/>
+          <w:szCs w:val="21"/>
         </w:rPr>
         <w:t xml:space="preserve">Espaço para escrever:</w:t>
       </w:r>
@@ -1732,12 +1848,12 @@
         <w:pBdr>
           <w:bottom w:val="single" w:color="C9D6E3" w:sz="4" w:space="4"/>
         </w:pBdr>
-        <w:spacing w:after="220"/>
-      </w:pPr>
-      <w:r>
-        <w:rPr>
-          <w:sz w:val="22"/>
-          <w:szCs w:val="22"/>
+        <w:spacing w:after="160"/>
+      </w:pPr>
+      <w:r>
+        <w:rPr>
+          <w:sz w:val="21"/>
+          <w:szCs w:val="21"/>
         </w:rPr>
         <w:t xml:space="preserve"> </w:t>
       </w:r>
@@ -1747,12 +1863,12 @@
         <w:pBdr>
           <w:bottom w:val="single" w:color="C9D6E3" w:sz="4" w:space="4"/>
         </w:pBdr>
-        <w:spacing w:after="220"/>
-      </w:pPr>
-      <w:r>
-        <w:rPr>
-          <w:sz w:val="22"/>
-          <w:szCs w:val="22"/>
+        <w:spacing w:after="160"/>
+      </w:pPr>
+      <w:r>
+        <w:rPr>
+          <w:sz w:val="21"/>
+          <w:szCs w:val="21"/>
         </w:rPr>
         <w:t xml:space="preserve"> </w:t>
       </w:r>
@@ -1762,12 +1878,12 @@
         <w:pBdr>
           <w:bottom w:val="single" w:color="C9D6E3" w:sz="4" w:space="4"/>
         </w:pBdr>
-        <w:spacing w:after="220"/>
-      </w:pPr>
-      <w:r>
-        <w:rPr>
-          <w:sz w:val="22"/>
-          <w:szCs w:val="22"/>
+        <w:spacing w:after="160"/>
+      </w:pPr>
+      <w:r>
+        <w:rPr>
+          <w:sz w:val="21"/>
+          <w:szCs w:val="21"/>
         </w:rPr>
         <w:t xml:space="preserve"> </w:t>
       </w:r>
@@ -1777,12 +1893,12 @@
         <w:pBdr>
           <w:bottom w:val="single" w:color="C9D6E3" w:sz="4" w:space="4"/>
         </w:pBdr>
-        <w:spacing w:after="220"/>
-      </w:pPr>
-      <w:r>
-        <w:rPr>
-          <w:sz w:val="22"/>
-          <w:szCs w:val="22"/>
+        <w:spacing w:after="160"/>
+      </w:pPr>
+      <w:r>
+        <w:rPr>
+          <w:sz w:val="21"/>
+          <w:szCs w:val="21"/>
         </w:rPr>
         <w:t xml:space="preserve"> </w:t>
       </w:r>
@@ -1792,35 +1908,20 @@
         <w:pBdr>
           <w:bottom w:val="single" w:color="C9D6E3" w:sz="4" w:space="4"/>
         </w:pBdr>
-        <w:spacing w:after="220"/>
-      </w:pPr>
-      <w:r>
-        <w:rPr>
-          <w:sz w:val="22"/>
-          <w:szCs w:val="22"/>
+        <w:spacing w:after="160"/>
+      </w:pPr>
+      <w:r>
+        <w:rPr>
+          <w:sz w:val="21"/>
+          <w:szCs w:val="21"/>
         </w:rPr>
         <w:t xml:space="preserve"> </w:t>
       </w:r>
     </w:p>
     <w:p>
       <w:pPr>
-        <w:pBdr>
-          <w:bottom w:val="single" w:color="C9D6E3" w:sz="4" w:space="4"/>
-        </w:pBdr>
-        <w:spacing w:after="220"/>
-      </w:pPr>
-      <w:r>
-        <w:rPr>
-          <w:sz w:val="22"/>
-          <w:szCs w:val="22"/>
-        </w:rPr>
-        <w:t xml:space="preserve"> </w:t>
-      </w:r>
-    </w:p>
-    <w:p>
-      <w:pPr>
         <w:shd w:fill="B4483A" w:val="clear"/>
-        <w:spacing w:after="150" w:before="500"/>
+        <w:spacing w:after="110" w:before="340"/>
       </w:pPr>
       <w:r>
         <w:rPr>
@@ -1828,8 +1929,8 @@
           <w:b/>
           <w:bCs/>
           <w:color w:val="FFFFFF"/>
-          <w:sz w:val="20"/>
-          <w:szCs w:val="20"/>
+          <w:sz w:val="18"/>
+          <w:szCs w:val="18"/>
         </w:rPr>
         <w:t xml:space="preserve">  ETAPA 5  </w:t>
       </w:r>
@@ -1839,15 +1940,27 @@
           <w:b/>
           <w:bCs/>
           <w:color w:val="FFFFFF"/>
-          <w:sz w:val="24"/>
-          <w:szCs w:val="24"/>
+          <w:sz w:val="23"/>
+          <w:szCs w:val="23"/>
         </w:rPr>
         <w:t xml:space="preserve">   Gramática de Apoio Aplicada à Conversação</w:t>
       </w:r>
-    </w:p>
-    <w:p>
-      <w:pPr>
-        <w:spacing w:after="160" w:line="300"/>
+      <w:r>
+        <w:rPr>
+          <w:rFonts w:ascii="Calibri" w:cs="Calibri" w:eastAsia="Calibri" w:hAnsi="Calibri"/>
+          <w:i/>
+          <w:iCs/>
+          <w:color w:val="D8E7F2"/>
+          <w:sz w:val="17"/>
+          <w:szCs w:val="17"/>
+        </w:rPr>
+        <w:br/>
+        <w:t xml:space="preserve">   Grammar for Conversation</w:t>
+      </w:r>
+    </w:p>
+    <w:p>
+      <w:pPr>
+        <w:spacing w:after="120" w:line="276"/>
       </w:pPr>
       <w:r>
         <w:rPr>
@@ -1857,8 +1970,8 @@
           <w:i w:val="false"/>
           <w:iCs w:val="false"/>
           <w:color w:val="444444"/>
-          <w:sz w:val="22"/>
-          <w:szCs w:val="22"/>
+          <w:sz w:val="21"/>
+          <w:szCs w:val="21"/>
         </w:rPr>
         <w:t xml:space="preserve">Para falar sobre sua trajetória, você vai alternar entre Simple Past e Present Perfect o tempo todo. Essa é a estrutura de apoio deste tema.</w:t>
       </w:r>
@@ -1889,10 +2002,10 @@
             <w:tcW w:type="dxa" w:w="2200"/>
             <w:shd w:fill="B4483A" w:val="clear"/>
             <w:tcMar>
-              <w:top w:type="dxa" w:w="100"/>
-              <w:left w:type="dxa" w:w="120"/>
-              <w:bottom w:type="dxa" w:w="100"/>
-              <w:right w:type="dxa" w:w="120"/>
+              <w:top w:type="dxa" w:w="80"/>
+              <w:left w:type="dxa" w:w="110"/>
+              <w:bottom w:type="dxa" w:w="80"/>
+              <w:right w:type="dxa" w:w="110"/>
             </w:tcMar>
             <w:vAlign w:val="center"/>
           </w:tcPr>
@@ -1903,8 +2016,8 @@
                 <w:b/>
                 <w:bCs/>
                 <w:color w:val="FFFFFF"/>
-                <w:sz w:val="20"/>
-                <w:szCs w:val="20"/>
+                <w:sz w:val="19"/>
+                <w:szCs w:val="19"/>
               </w:rPr>
               <w:t xml:space="preserve">Estrutura</w:t>
             </w:r>
@@ -1915,10 +2028,10 @@
             <w:tcW w:type="dxa" w:w="3600"/>
             <w:shd w:fill="B4483A" w:val="clear"/>
             <w:tcMar>
-              <w:top w:type="dxa" w:w="100"/>
-              <w:left w:type="dxa" w:w="120"/>
-              <w:bottom w:type="dxa" w:w="100"/>
-              <w:right w:type="dxa" w:w="120"/>
+              <w:top w:type="dxa" w:w="80"/>
+              <w:left w:type="dxa" w:w="110"/>
+              <w:bottom w:type="dxa" w:w="80"/>
+              <w:right w:type="dxa" w:w="110"/>
             </w:tcMar>
             <w:vAlign w:val="center"/>
           </w:tcPr>
@@ -1929,8 +2042,8 @@
                 <w:b/>
                 <w:bCs/>
                 <w:color w:val="FFFFFF"/>
-                <w:sz w:val="20"/>
-                <w:szCs w:val="20"/>
+                <w:sz w:val="19"/>
+                <w:szCs w:val="19"/>
               </w:rPr>
               <w:t xml:space="preserve">Exemplo (EN)</w:t>
             </w:r>
@@ -1941,10 +2054,10 @@
             <w:tcW w:type="dxa" w:w="3400"/>
             <w:shd w:fill="B4483A" w:val="clear"/>
             <w:tcMar>
-              <w:top w:type="dxa" w:w="100"/>
-              <w:left w:type="dxa" w:w="120"/>
-              <w:bottom w:type="dxa" w:w="100"/>
-              <w:right w:type="dxa" w:w="120"/>
+              <w:top w:type="dxa" w:w="80"/>
+              <w:left w:type="dxa" w:w="110"/>
+              <w:bottom w:type="dxa" w:w="80"/>
+              <w:right w:type="dxa" w:w="110"/>
             </w:tcMar>
             <w:vAlign w:val="center"/>
           </w:tcPr>
@@ -1955,8 +2068,8 @@
                 <w:b/>
                 <w:bCs/>
                 <w:color w:val="FFFFFF"/>
-                <w:sz w:val="20"/>
-                <w:szCs w:val="20"/>
+                <w:sz w:val="19"/>
+                <w:szCs w:val="19"/>
               </w:rPr>
               <w:t xml:space="preserve">Tradução (PT)</w:t>
             </w:r>
@@ -1968,10 +2081,10 @@
           <w:tcPr>
             <w:tcW w:type="dxa" w:w="2200"/>
             <w:tcMar>
-              <w:top w:type="dxa" w:w="90"/>
-              <w:left w:type="dxa" w:w="120"/>
-              <w:bottom w:type="dxa" w:w="90"/>
-              <w:right w:type="dxa" w:w="120"/>
+              <w:top w:type="dxa" w:w="70"/>
+              <w:left w:type="dxa" w:w="110"/>
+              <w:bottom w:type="dxa" w:w="70"/>
+              <w:right w:type="dxa" w:w="110"/>
             </w:tcMar>
             <w:vAlign w:val="center"/>
           </w:tcPr>
@@ -1984,8 +2097,8 @@
                 <w:i w:val="false"/>
                 <w:iCs w:val="false"/>
                 <w:color w:val="444444"/>
-                <w:sz w:val="20"/>
-                <w:szCs w:val="20"/>
+                <w:sz w:val="19"/>
+                <w:szCs w:val="19"/>
               </w:rPr>
               <w:t xml:space="preserve">Present Perfect
 (have/has + particípio)</w:t>
@@ -1996,10 +2109,10 @@
           <w:tcPr>
             <w:tcW w:type="dxa" w:w="3600"/>
             <w:tcMar>
-              <w:top w:type="dxa" w:w="90"/>
-              <w:left w:type="dxa" w:w="120"/>
-              <w:bottom w:type="dxa" w:w="90"/>
-              <w:right w:type="dxa" w:w="120"/>
+              <w:top w:type="dxa" w:w="70"/>
+              <w:left w:type="dxa" w:w="110"/>
+              <w:bottom w:type="dxa" w:w="70"/>
+              <w:right w:type="dxa" w:w="110"/>
             </w:tcMar>
             <w:vAlign w:val="center"/>
           </w:tcPr>
@@ -2012,8 +2125,8 @@
                 <w:i/>
                 <w:iCs/>
                 <w:color w:val="444444"/>
-                <w:sz w:val="20"/>
-                <w:szCs w:val="20"/>
+                <w:sz w:val="19"/>
+                <w:szCs w:val="19"/>
               </w:rPr>
               <w:t xml:space="preserve">I have worked in three different industries.</w:t>
             </w:r>
@@ -2023,26 +2136,26 @@
           <w:tcPr>
             <w:tcW w:type="dxa" w:w="3400"/>
             <w:tcMar>
-              <w:top w:type="dxa" w:w="90"/>
-              <w:left w:type="dxa" w:w="120"/>
-              <w:bottom w:type="dxa" w:w="90"/>
-              <w:right w:type="dxa" w:w="120"/>
-            </w:tcMar>
-            <w:vAlign w:val="center"/>
-          </w:tcPr>
-          <w:p>
-            <w:r>
-              <w:rPr>
-                <w:rFonts w:ascii="Calibri" w:cs="Calibri" w:eastAsia="Calibri" w:hAnsi="Calibri"/>
-                <w:b w:val="false"/>
-                <w:bCs w:val="false"/>
-                <w:i w:val="false"/>
-                <w:iCs w:val="false"/>
-                <w:color w:val="444444"/>
-                <w:sz w:val="20"/>
-                <w:szCs w:val="20"/>
-              </w:rPr>
-              <w:t xml:space="preserve">Usado quando o fato ainda se conecta ao presente — sua experiência acumulada até agora, sem dizer quando exatamente.</w:t>
+              <w:top w:type="dxa" w:w="70"/>
+              <w:left w:type="dxa" w:w="110"/>
+              <w:bottom w:type="dxa" w:w="70"/>
+              <w:right w:type="dxa" w:w="110"/>
+            </w:tcMar>
+            <w:vAlign w:val="center"/>
+          </w:tcPr>
+          <w:p>
+            <w:r>
+              <w:rPr>
+                <w:rFonts w:ascii="Calibri" w:cs="Calibri" w:eastAsia="Calibri" w:hAnsi="Calibri"/>
+                <w:b w:val="false"/>
+                <w:bCs w:val="false"/>
+                <w:i w:val="false"/>
+                <w:iCs w:val="false"/>
+                <w:color w:val="444444"/>
+                <w:sz w:val="19"/>
+                <w:szCs w:val="19"/>
+              </w:rPr>
+              <w:t xml:space="preserve">Usado quando o fato ainda se conecta ao presente, sua experiência acumulada até agora, sem dizer quando exatamente.</w:t>
             </w:r>
           </w:p>
         </w:tc>
@@ -2052,10 +2165,10 @@
           <w:tcPr>
             <w:tcW w:type="dxa" w:w="2200"/>
             <w:tcMar>
-              <w:top w:type="dxa" w:w="90"/>
-              <w:left w:type="dxa" w:w="120"/>
-              <w:bottom w:type="dxa" w:w="90"/>
-              <w:right w:type="dxa" w:w="120"/>
+              <w:top w:type="dxa" w:w="70"/>
+              <w:left w:type="dxa" w:w="110"/>
+              <w:bottom w:type="dxa" w:w="70"/>
+              <w:right w:type="dxa" w:w="110"/>
             </w:tcMar>
             <w:vAlign w:val="center"/>
           </w:tcPr>
@@ -2068,8 +2181,8 @@
                 <w:i w:val="false"/>
                 <w:iCs w:val="false"/>
                 <w:color w:val="444444"/>
-                <w:sz w:val="20"/>
-                <w:szCs w:val="20"/>
+                <w:sz w:val="19"/>
+                <w:szCs w:val="19"/>
               </w:rPr>
               <w:t xml:space="preserve">Simple Past
 (verbo no passado)</w:t>
@@ -2080,10 +2193,10 @@
           <w:tcPr>
             <w:tcW w:type="dxa" w:w="3600"/>
             <w:tcMar>
-              <w:top w:type="dxa" w:w="90"/>
-              <w:left w:type="dxa" w:w="120"/>
-              <w:bottom w:type="dxa" w:w="90"/>
-              <w:right w:type="dxa" w:w="120"/>
+              <w:top w:type="dxa" w:w="70"/>
+              <w:left w:type="dxa" w:w="110"/>
+              <w:bottom w:type="dxa" w:w="70"/>
+              <w:right w:type="dxa" w:w="110"/>
             </w:tcMar>
             <w:vAlign w:val="center"/>
           </w:tcPr>
@@ -2096,8 +2209,8 @@
                 <w:i/>
                 <w:iCs/>
                 <w:color w:val="444444"/>
-                <w:sz w:val="20"/>
-                <w:szCs w:val="20"/>
+                <w:sz w:val="19"/>
+                <w:szCs w:val="19"/>
               </w:rPr>
               <w:t xml:space="preserve">I worked in finance for two years before moving to tech.</w:t>
             </w:r>
@@ -2107,24 +2220,24 @@
           <w:tcPr>
             <w:tcW w:type="dxa" w:w="3400"/>
             <w:tcMar>
-              <w:top w:type="dxa" w:w="90"/>
-              <w:left w:type="dxa" w:w="120"/>
-              <w:bottom w:type="dxa" w:w="90"/>
-              <w:right w:type="dxa" w:w="120"/>
-            </w:tcMar>
-            <w:vAlign w:val="center"/>
-          </w:tcPr>
-          <w:p>
-            <w:r>
-              <w:rPr>
-                <w:rFonts w:ascii="Calibri" w:cs="Calibri" w:eastAsia="Calibri" w:hAnsi="Calibri"/>
-                <w:b w:val="false"/>
-                <w:bCs w:val="false"/>
-                <w:i w:val="false"/>
-                <w:iCs w:val="false"/>
-                <w:color w:val="444444"/>
-                <w:sz w:val="20"/>
-                <w:szCs w:val="20"/>
+              <w:top w:type="dxa" w:w="70"/>
+              <w:left w:type="dxa" w:w="110"/>
+              <w:bottom w:type="dxa" w:w="70"/>
+              <w:right w:type="dxa" w:w="110"/>
+            </w:tcMar>
+            <w:vAlign w:val="center"/>
+          </w:tcPr>
+          <w:p>
+            <w:r>
+              <w:rPr>
+                <w:rFonts w:ascii="Calibri" w:cs="Calibri" w:eastAsia="Calibri" w:hAnsi="Calibri"/>
+                <w:b w:val="false"/>
+                <w:bCs w:val="false"/>
+                <w:i w:val="false"/>
+                <w:iCs w:val="false"/>
+                <w:color w:val="444444"/>
+                <w:sz w:val="19"/>
+                <w:szCs w:val="19"/>
               </w:rPr>
               <w:t xml:space="preserve">Usado quando o fato é um evento específico, encerrado, geralmente com um tempo marcado ("for two years", "in 2021").</w:t>
             </w:r>
@@ -2136,10 +2249,10 @@
           <w:tcPr>
             <w:tcW w:type="dxa" w:w="2200"/>
             <w:tcMar>
-              <w:top w:type="dxa" w:w="90"/>
-              <w:left w:type="dxa" w:w="120"/>
-              <w:bottom w:type="dxa" w:w="90"/>
-              <w:right w:type="dxa" w:w="120"/>
+              <w:top w:type="dxa" w:w="70"/>
+              <w:left w:type="dxa" w:w="110"/>
+              <w:bottom w:type="dxa" w:w="70"/>
+              <w:right w:type="dxa" w:w="110"/>
             </w:tcMar>
             <w:vAlign w:val="center"/>
           </w:tcPr>
@@ -2152,8 +2265,8 @@
                 <w:i w:val="false"/>
                 <w:iCs w:val="false"/>
                 <w:color w:val="444444"/>
-                <w:sz w:val="20"/>
-                <w:szCs w:val="20"/>
+                <w:sz w:val="19"/>
+                <w:szCs w:val="19"/>
               </w:rPr>
               <w:t xml:space="preserve">Present Perfect Continuous
 (have/has been + -ing)</w:t>
@@ -2164,10 +2277,10 @@
           <w:tcPr>
             <w:tcW w:type="dxa" w:w="3600"/>
             <w:tcMar>
-              <w:top w:type="dxa" w:w="90"/>
-              <w:left w:type="dxa" w:w="120"/>
-              <w:bottom w:type="dxa" w:w="90"/>
-              <w:right w:type="dxa" w:w="120"/>
+              <w:top w:type="dxa" w:w="70"/>
+              <w:left w:type="dxa" w:w="110"/>
+              <w:bottom w:type="dxa" w:w="70"/>
+              <w:right w:type="dxa" w:w="110"/>
             </w:tcMar>
             <w:vAlign w:val="center"/>
           </w:tcPr>
@@ -2180,8 +2293,8 @@
                 <w:i/>
                 <w:iCs/>
                 <w:color w:val="444444"/>
-                <w:sz w:val="20"/>
-                <w:szCs w:val="20"/>
+                <w:sz w:val="19"/>
+                <w:szCs w:val="19"/>
               </w:rPr>
               <w:t xml:space="preserve">I've been focusing more on leadership lately.</w:t>
             </w:r>
@@ -2191,26 +2304,26 @@
           <w:tcPr>
             <w:tcW w:type="dxa" w:w="3400"/>
             <w:tcMar>
-              <w:top w:type="dxa" w:w="90"/>
-              <w:left w:type="dxa" w:w="120"/>
-              <w:bottom w:type="dxa" w:w="90"/>
-              <w:right w:type="dxa" w:w="120"/>
-            </w:tcMar>
-            <w:vAlign w:val="center"/>
-          </w:tcPr>
-          <w:p>
-            <w:r>
-              <w:rPr>
-                <w:rFonts w:ascii="Calibri" w:cs="Calibri" w:eastAsia="Calibri" w:hAnsi="Calibri"/>
-                <w:b w:val="false"/>
-                <w:bCs w:val="false"/>
-                <w:i w:val="false"/>
-                <w:iCs w:val="false"/>
-                <w:color w:val="444444"/>
-                <w:sz w:val="20"/>
-                <w:szCs w:val="20"/>
-              </w:rPr>
-              <w:t xml:space="preserve">Usado para algo que começou no passado e continua acontecendo — ótimo para falar de mudanças recentes em você.</w:t>
+              <w:top w:type="dxa" w:w="70"/>
+              <w:left w:type="dxa" w:w="110"/>
+              <w:bottom w:type="dxa" w:w="70"/>
+              <w:right w:type="dxa" w:w="110"/>
+            </w:tcMar>
+            <w:vAlign w:val="center"/>
+          </w:tcPr>
+          <w:p>
+            <w:r>
+              <w:rPr>
+                <w:rFonts w:ascii="Calibri" w:cs="Calibri" w:eastAsia="Calibri" w:hAnsi="Calibri"/>
+                <w:b w:val="false"/>
+                <w:bCs w:val="false"/>
+                <w:i w:val="false"/>
+                <w:iCs w:val="false"/>
+                <w:color w:val="444444"/>
+                <w:sz w:val="19"/>
+                <w:szCs w:val="19"/>
+              </w:rPr>
+              <w:t xml:space="preserve">Usado para algo que começou no passado e continua acontecendo, ótimo para falar de mudanças recentes em você.</w:t>
             </w:r>
           </w:p>
         </w:tc>
@@ -2218,7 +2331,7 @@
     </w:tbl>
     <w:p>
       <w:pPr>
-        <w:spacing w:after="160" w:line="300"/>
+        <w:spacing w:after="120" w:line="276"/>
       </w:pPr>
       <w:r>
         <w:rPr>
@@ -2228,8 +2341,8 @@
           <w:i w:val="false"/>
           <w:iCs w:val="false"/>
           <w:color w:val="444444"/>
-          <w:sz w:val="22"/>
-          <w:szCs w:val="22"/>
+          <w:sz w:val="21"/>
+          <w:szCs w:val="21"/>
         </w:rPr>
         <w:t xml:space="preserve">Dica prática: se você consegue colocar uma data ou período fechado na frase ("in 2019", "last year", "for six months" quando o período já terminou), use Simple Past. Se a ideia é "até agora", use Present Perfect.</w:t>
       </w:r>
@@ -2237,7 +2350,7 @@
     <w:p>
       <w:pPr>
         <w:shd w:fill="1690A8" w:val="clear"/>
-        <w:spacing w:after="150" w:before="500"/>
+        <w:spacing w:after="110" w:before="340"/>
       </w:pPr>
       <w:r>
         <w:rPr>
@@ -2245,8 +2358,8 @@
           <w:b/>
           <w:bCs/>
           <w:color w:val="FFFFFF"/>
-          <w:sz w:val="20"/>
-          <w:szCs w:val="20"/>
+          <w:sz w:val="18"/>
+          <w:szCs w:val="18"/>
         </w:rPr>
         <w:t xml:space="preserve">  ETAPA 6  </w:t>
       </w:r>
@@ -2256,15 +2369,27 @@
           <w:b/>
           <w:bCs/>
           <w:color w:val="FFFFFF"/>
-          <w:sz w:val="24"/>
-          <w:szCs w:val="24"/>
-        </w:rPr>
-        <w:t xml:space="preserve">   Speaking — Perguntas Abertas</w:t>
-      </w:r>
-    </w:p>
-    <w:p>
-      <w:pPr>
-        <w:spacing w:after="160" w:line="300"/>
+          <w:sz w:val="23"/>
+          <w:szCs w:val="23"/>
+        </w:rPr>
+        <w:t xml:space="preserve">   Speaking: Perguntas Abertas</w:t>
+      </w:r>
+      <w:r>
+        <w:rPr>
+          <w:rFonts w:ascii="Calibri" w:cs="Calibri" w:eastAsia="Calibri" w:hAnsi="Calibri"/>
+          <w:i/>
+          <w:iCs/>
+          <w:color w:val="D8E7F2"/>
+          <w:sz w:val="17"/>
+          <w:szCs w:val="17"/>
+        </w:rPr>
+        <w:br/>
+        <w:t xml:space="preserve">   Open-Ended Speaking</w:t>
+      </w:r>
+    </w:p>
+    <w:p>
+      <w:pPr>
+        <w:spacing w:after="120" w:line="276"/>
       </w:pPr>
       <w:r>
         <w:rPr>
@@ -2274,10 +2399,10 @@
           <w:i w:val="false"/>
           <w:iCs w:val="false"/>
           <w:color w:val="444444"/>
-          <w:sz w:val="22"/>
-          <w:szCs w:val="22"/>
-        </w:rPr>
-        <w:t xml:space="preserve">Responda em voz alta, gravando se possível. Não vale responder em uma frase só — use o que você escreveu na Etapa 4 como base, mas fale livremente.</w:t>
+          <w:sz w:val="21"/>
+          <w:szCs w:val="21"/>
+        </w:rPr>
+        <w:t xml:space="preserve">Responda em voz alta, gravando se possível. Não vale responder em uma frase só: use o que você escreveu na Etapa 4 como base, mas fale livremente.</w:t>
       </w:r>
     </w:p>
     <w:p>
@@ -2287,14 +2412,14 @@
           <w:ilvl w:val="0"/>
           <w:numId w:val="2"/>
         </w:numPr>
-        <w:spacing w:after="140" w:line="280"/>
+        <w:spacing w:after="100" w:line="264"/>
       </w:pPr>
       <w:r>
         <w:rPr>
           <w:rFonts w:ascii="Calibri" w:cs="Calibri" w:eastAsia="Calibri" w:hAnsi="Calibri"/>
           <w:color w:val="13293D"/>
-          <w:sz w:val="22"/>
-          <w:szCs w:val="22"/>
+          <w:sz w:val="21"/>
+          <w:szCs w:val="21"/>
         </w:rPr>
         <w:t xml:space="preserve">What's your professional background, and how did you end up where you are today?</w:t>
       </w:r>
@@ -2306,14 +2431,14 @@
           <w:ilvl w:val="0"/>
           <w:numId w:val="2"/>
         </w:numPr>
-        <w:spacing w:after="140" w:line="280"/>
+        <w:spacing w:after="100" w:line="264"/>
       </w:pPr>
       <w:r>
         <w:rPr>
           <w:rFonts w:ascii="Calibri" w:cs="Calibri" w:eastAsia="Calibri" w:hAnsi="Calibri"/>
           <w:color w:val="13293D"/>
-          <w:sz w:val="22"/>
-          <w:szCs w:val="22"/>
+          <w:sz w:val="21"/>
+          <w:szCs w:val="21"/>
         </w:rPr>
         <w:t xml:space="preserve">Looking back, what would you say was the biggest turning point in your career so far?</w:t>
       </w:r>
@@ -2325,14 +2450,14 @@
           <w:ilvl w:val="0"/>
           <w:numId w:val="2"/>
         </w:numPr>
-        <w:spacing w:after="140" w:line="280"/>
+        <w:spacing w:after="100" w:line="264"/>
       </w:pPr>
       <w:r>
         <w:rPr>
           <w:rFonts w:ascii="Calibri" w:cs="Calibri" w:eastAsia="Calibri" w:hAnsi="Calibri"/>
           <w:color w:val="13293D"/>
-          <w:sz w:val="22"/>
-          <w:szCs w:val="22"/>
+          <w:sz w:val="21"/>
+          <w:szCs w:val="21"/>
         </w:rPr>
         <w:t xml:space="preserve">How would your closest coworkers describe your personality? Do you agree with them?</w:t>
       </w:r>
@@ -2344,16 +2469,16 @@
           <w:ilvl w:val="0"/>
           <w:numId w:val="2"/>
         </w:numPr>
-        <w:spacing w:after="140" w:line="280"/>
+        <w:spacing w:after="100" w:line="264"/>
       </w:pPr>
       <w:r>
         <w:rPr>
           <w:rFonts w:ascii="Calibri" w:cs="Calibri" w:eastAsia="Calibri" w:hAnsi="Calibri"/>
           <w:color w:val="13293D"/>
-          <w:sz w:val="22"/>
-          <w:szCs w:val="22"/>
-        </w:rPr>
-        <w:t xml:space="preserve">What's a milestone you're genuinely proud of — and why does it matter to you?</w:t>
+          <w:sz w:val="21"/>
+          <w:szCs w:val="21"/>
+        </w:rPr>
+        <w:t xml:space="preserve">What's a milestone you're genuinely proud of, and why does it matter to you?</w:t>
       </w:r>
     </w:p>
     <w:p>
@@ -2363,14 +2488,14 @@
           <w:ilvl w:val="0"/>
           <w:numId w:val="2"/>
         </w:numPr>
-        <w:spacing w:after="140" w:line="280"/>
+        <w:spacing w:after="100" w:line="264"/>
       </w:pPr>
       <w:r>
         <w:rPr>
           <w:rFonts w:ascii="Calibri" w:cs="Calibri" w:eastAsia="Calibri" w:hAnsi="Calibri"/>
           <w:color w:val="13293D"/>
-          <w:sz w:val="22"/>
-          <w:szCs w:val="22"/>
+          <w:sz w:val="21"/>
+          <w:szCs w:val="21"/>
         </w:rPr>
         <w:t xml:space="preserve">What's something about yourself that has changed a lot in the last few years?</w:t>
       </w:r>
@@ -2382,14 +2507,14 @@
           <w:ilvl w:val="0"/>
           <w:numId w:val="2"/>
         </w:numPr>
-        <w:spacing w:after="140" w:line="280"/>
+        <w:spacing w:after="100" w:line="264"/>
       </w:pPr>
       <w:r>
         <w:rPr>
           <w:rFonts w:ascii="Calibri" w:cs="Calibri" w:eastAsia="Calibri" w:hAnsi="Calibri"/>
           <w:color w:val="13293D"/>
-          <w:sz w:val="22"/>
-          <w:szCs w:val="22"/>
+          <w:sz w:val="21"/>
+          <w:szCs w:val="21"/>
         </w:rPr>
         <w:t xml:space="preserve">If you had to describe yourself in three words, which would you pick, and why those three?</w:t>
       </w:r>
@@ -2401,16 +2526,16 @@
           <w:ilvl w:val="0"/>
           <w:numId w:val="2"/>
         </w:numPr>
-        <w:spacing w:after="140" w:line="280"/>
+        <w:spacing w:after="100" w:line="264"/>
       </w:pPr>
       <w:r>
         <w:rPr>
           <w:rFonts w:ascii="Calibri" w:cs="Calibri" w:eastAsia="Calibri" w:hAnsi="Calibri"/>
           <w:color w:val="13293D"/>
-          <w:sz w:val="22"/>
-          <w:szCs w:val="22"/>
-        </w:rPr>
-        <w:t xml:space="preserve">What's a "work in progress" for you right now — something you're actively trying to improve?</w:t>
+          <w:sz w:val="21"/>
+          <w:szCs w:val="21"/>
+        </w:rPr>
+        <w:t xml:space="preserve">What's a "work in progress" for you right now, something you're actively trying to improve?</w:t>
       </w:r>
     </w:p>
     <w:p>
@@ -2420,14 +2545,14 @@
           <w:ilvl w:val="0"/>
           <w:numId w:val="2"/>
         </w:numPr>
-        <w:spacing w:after="140" w:line="280"/>
+        <w:spacing w:after="100" w:line="264"/>
       </w:pPr>
       <w:r>
         <w:rPr>
           <w:rFonts w:ascii="Calibri" w:cs="Calibri" w:eastAsia="Calibri" w:hAnsi="Calibri"/>
           <w:color w:val="13293D"/>
-          <w:sz w:val="22"/>
-          <w:szCs w:val="22"/>
+          <w:sz w:val="21"/>
+          <w:szCs w:val="21"/>
         </w:rPr>
         <w:t xml:space="preserve">How is the way you introduce yourself different at work versus in a social setting?</w:t>
       </w:r>
@@ -2439,14 +2564,14 @@
           <w:ilvl w:val="0"/>
           <w:numId w:val="2"/>
         </w:numPr>
-        <w:spacing w:after="140" w:line="280"/>
+        <w:spacing w:after="100" w:line="264"/>
       </w:pPr>
       <w:r>
         <w:rPr>
           <w:rFonts w:ascii="Calibri" w:cs="Calibri" w:eastAsia="Calibri" w:hAnsi="Calibri"/>
           <w:color w:val="13293D"/>
-          <w:sz w:val="22"/>
-          <w:szCs w:val="22"/>
+          <w:sz w:val="21"/>
+          <w:szCs w:val="21"/>
         </w:rPr>
         <w:t xml:space="preserve">Who influenced the way you see your own career the most, and how?</w:t>
       </w:r>
@@ -2458,21 +2583,21 @@
           <w:ilvl w:val="0"/>
           <w:numId w:val="2"/>
         </w:numPr>
-        <w:spacing w:after="140" w:line="280"/>
+        <w:spacing w:after="100" w:line="264"/>
       </w:pPr>
       <w:r>
         <w:rPr>
           <w:rFonts w:ascii="Calibri" w:cs="Calibri" w:eastAsia="Calibri" w:hAnsi="Calibri"/>
           <w:color w:val="13293D"/>
-          <w:sz w:val="22"/>
-          <w:szCs w:val="22"/>
+          <w:sz w:val="21"/>
+          <w:szCs w:val="21"/>
         </w:rPr>
         <w:t xml:space="preserve">If a stranger asked "so, what's your story?", how would you actually answer that?</w:t>
       </w:r>
     </w:p>
     <w:p>
       <w:pPr>
-        <w:spacing w:after="160" w:line="300"/>
+        <w:spacing w:after="120" w:line="276"/>
       </w:pPr>
       <w:r>
         <w:rPr>
@@ -2482,8 +2607,8 @@
           <w:i w:val="false"/>
           <w:iCs w:val="false"/>
           <w:color w:val="444444"/>
-          <w:sz w:val="22"/>
-          <w:szCs w:val="22"/>
+          <w:sz w:val="21"/>
+          <w:szCs w:val="21"/>
         </w:rPr>
         <w:t xml:space="preserve">Expressões úteis para esta conversa:</w:t>
       </w:r>
@@ -2495,16 +2620,16 @@
           <w:ilvl w:val="0"/>
           <w:numId w:val="3"/>
         </w:numPr>
-        <w:spacing w:after="80"/>
+        <w:spacing w:after="60"/>
       </w:pPr>
       <w:r>
         <w:rPr>
           <w:rFonts w:ascii="Calibri" w:cs="Calibri" w:eastAsia="Calibri" w:hAnsi="Calibri"/>
           <w:color w:val="444444"/>
-          <w:sz w:val="21"/>
-          <w:szCs w:val="21"/>
-        </w:rPr>
-        <w:t xml:space="preserve">"If I'm being honest..." — para introduzir uma resposta mais sincera/vulnerável.</w:t>
+          <w:sz w:val="20"/>
+          <w:szCs w:val="20"/>
+        </w:rPr>
+        <w:t xml:space="preserve">"If I'm being honest...", para introduzir uma resposta mais sincera/vulnerável.</w:t>
       </w:r>
     </w:p>
     <w:p>
@@ -2514,16 +2639,16 @@
           <w:ilvl w:val="0"/>
           <w:numId w:val="3"/>
         </w:numPr>
-        <w:spacing w:after="80"/>
+        <w:spacing w:after="60"/>
       </w:pPr>
       <w:r>
         <w:rPr>
           <w:rFonts w:ascii="Calibri" w:cs="Calibri" w:eastAsia="Calibri" w:hAnsi="Calibri"/>
           <w:color w:val="444444"/>
-          <w:sz w:val="21"/>
-          <w:szCs w:val="21"/>
-        </w:rPr>
-        <w:t xml:space="preserve">"Looking back..." — para introduzir uma reflexão sobre o passado.</w:t>
+          <w:sz w:val="20"/>
+          <w:szCs w:val="20"/>
+        </w:rPr>
+        <w:t xml:space="preserve">"Looking back...", para introduzir uma reflexão sobre o passado.</w:t>
       </w:r>
     </w:p>
     <w:p>
@@ -2533,16 +2658,16 @@
           <w:ilvl w:val="0"/>
           <w:numId w:val="3"/>
         </w:numPr>
-        <w:spacing w:after="80"/>
+        <w:spacing w:after="60"/>
       </w:pPr>
       <w:r>
         <w:rPr>
           <w:rFonts w:ascii="Calibri" w:cs="Calibri" w:eastAsia="Calibri" w:hAnsi="Calibri"/>
           <w:color w:val="444444"/>
-          <w:sz w:val="21"/>
-          <w:szCs w:val="21"/>
-        </w:rPr>
-        <w:t xml:space="preserve">"I'd like to think that..." — para opiniões sobre si mesmo, de forma mais leve/humilde.</w:t>
+          <w:sz w:val="20"/>
+          <w:szCs w:val="20"/>
+        </w:rPr>
+        <w:t xml:space="preserve">"I'd like to think that...", para opiniões sobre si mesmo, de forma mais leve/humilde.</w:t>
       </w:r>
     </w:p>
     <w:p>
@@ -2552,22 +2677,22 @@
           <w:ilvl w:val="0"/>
           <w:numId w:val="3"/>
         </w:numPr>
-        <w:spacing w:after="80"/>
+        <w:spacing w:after="60"/>
       </w:pPr>
       <w:r>
         <w:rPr>
           <w:rFonts w:ascii="Calibri" w:cs="Calibri" w:eastAsia="Calibri" w:hAnsi="Calibri"/>
           <w:color w:val="444444"/>
-          <w:sz w:val="21"/>
-          <w:szCs w:val="21"/>
-        </w:rPr>
-        <w:t xml:space="preserve">"That's actually a good question..." — para ganhar 2 segundos antes de responder algo mais difícil.</w:t>
+          <w:sz w:val="20"/>
+          <w:szCs w:val="20"/>
+        </w:rPr>
+        <w:t xml:space="preserve">"That's actually a good question...", para ganhar 2 segundos antes de responder algo mais difícil.</w:t>
       </w:r>
     </w:p>
     <w:p>
       <w:pPr>
         <w:shd w:fill="A67C2E" w:val="clear"/>
-        <w:spacing w:after="150" w:before="500"/>
+        <w:spacing w:after="110" w:before="340"/>
       </w:pPr>
       <w:r>
         <w:rPr>
@@ -2575,8 +2700,8 @@
           <w:b/>
           <w:bCs/>
           <w:color w:val="FFFFFF"/>
-          <w:sz w:val="20"/>
-          <w:szCs w:val="20"/>
+          <w:sz w:val="18"/>
+          <w:szCs w:val="18"/>
         </w:rPr>
         <w:t xml:space="preserve">  ETAPA EX  </w:t>
       </w:r>
@@ -2586,15 +2711,27 @@
           <w:b/>
           <w:bCs/>
           <w:color w:val="FFFFFF"/>
-          <w:sz w:val="24"/>
-          <w:szCs w:val="24"/>
+          <w:sz w:val="23"/>
+          <w:szCs w:val="23"/>
         </w:rPr>
         <w:t xml:space="preserve">   Complete com a Palavra Certa</w:t>
       </w:r>
-    </w:p>
-    <w:p>
-      <w:pPr>
-        <w:spacing w:after="160" w:line="300"/>
+      <w:r>
+        <w:rPr>
+          <w:rFonts w:ascii="Calibri" w:cs="Calibri" w:eastAsia="Calibri" w:hAnsi="Calibri"/>
+          <w:i/>
+          <w:iCs/>
+          <w:color w:val="D8E7F2"/>
+          <w:sz w:val="17"/>
+          <w:szCs w:val="17"/>
+        </w:rPr>
+        <w:br/>
+        <w:t xml:space="preserve">   Vocabulary Check</w:t>
+      </w:r>
+    </w:p>
+    <w:p>
+      <w:pPr>
+        <w:spacing w:after="120" w:line="276"/>
       </w:pPr>
       <w:r>
         <w:rPr>
@@ -2604,8 +2741,8 @@
           <w:i w:val="false"/>
           <w:iCs w:val="false"/>
           <w:color w:val="444444"/>
-          <w:sz w:val="22"/>
-          <w:szCs w:val="22"/>
+          <w:sz w:val="21"/>
+          <w:szCs w:val="21"/>
         </w:rPr>
         <w:t xml:space="preserve">Complete cada frase com uma palavra ou expressão da Etapa 1. Gabarito ao final desta seção.</w:t>
       </w:r>
@@ -2617,14 +2754,14 @@
           <w:ilvl w:val="0"/>
           <w:numId w:val="2"/>
         </w:numPr>
-        <w:spacing w:after="140" w:line="280"/>
+        <w:spacing w:after="100" w:line="264"/>
       </w:pPr>
       <w:r>
         <w:rPr>
           <w:rFonts w:ascii="Calibri" w:cs="Calibri" w:eastAsia="Calibri" w:hAnsi="Calibri"/>
           <w:color w:val="13293D"/>
-          <w:sz w:val="22"/>
-          <w:szCs w:val="22"/>
+          <w:sz w:val="21"/>
+          <w:szCs w:val="21"/>
         </w:rPr>
         <w:t xml:space="preserve">Getting promoted to team lead was a real ______ for me.</w:t>
       </w:r>
@@ -2636,16 +2773,16 @@
           <w:ilvl w:val="0"/>
           <w:numId w:val="2"/>
         </w:numPr>
-        <w:spacing w:after="140" w:line="280"/>
+        <w:spacing w:after="100" w:line="264"/>
       </w:pPr>
       <w:r>
         <w:rPr>
           <w:rFonts w:ascii="Calibri" w:cs="Calibri" w:eastAsia="Calibri" w:hAnsi="Calibri"/>
           <w:color w:val="13293D"/>
-          <w:sz w:val="22"/>
-          <w:szCs w:val="22"/>
-        </w:rPr>
-        <w:t xml:space="preserve">I'm pretty ______ — I love meeting new people at events.</w:t>
+          <w:sz w:val="21"/>
+          <w:szCs w:val="21"/>
+        </w:rPr>
+        <w:t xml:space="preserve">I'm pretty ______, I love meeting new people at events.</w:t>
       </w:r>
     </w:p>
     <w:p>
@@ -2655,14 +2792,14 @@
           <w:ilvl w:val="0"/>
           <w:numId w:val="2"/>
         </w:numPr>
-        <w:spacing w:after="140" w:line="280"/>
+        <w:spacing w:after="100" w:line="264"/>
       </w:pPr>
       <w:r>
         <w:rPr>
           <w:rFonts w:ascii="Calibri" w:cs="Calibri" w:eastAsia="Calibri" w:hAnsi="Calibri"/>
           <w:color w:val="13293D"/>
-          <w:sz w:val="22"/>
-          <w:szCs w:val="22"/>
+          <w:sz w:val="21"/>
+          <w:szCs w:val="21"/>
         </w:rPr>
         <w:t xml:space="preserve">She's still a ______ when it comes to delegating tasks.</w:t>
       </w:r>
@@ -2674,14 +2811,14 @@
           <w:ilvl w:val="0"/>
           <w:numId w:val="2"/>
         </w:numPr>
-        <w:spacing w:after="140" w:line="280"/>
+        <w:spacing w:after="100" w:line="264"/>
       </w:pPr>
       <w:r>
         <w:rPr>
           <w:rFonts w:ascii="Calibri" w:cs="Calibri" w:eastAsia="Calibri" w:hAnsi="Calibri"/>
           <w:color w:val="13293D"/>
-          <w:sz w:val="22"/>
-          <w:szCs w:val="22"/>
+          <w:sz w:val="21"/>
+          <w:szCs w:val="21"/>
         </w:rPr>
         <w:t xml:space="preserve">My interest in psychology is ______ how I grew up in a house full of teachers.</w:t>
       </w:r>
@@ -2693,21 +2830,21 @@
           <w:ilvl w:val="0"/>
           <w:numId w:val="2"/>
         </w:numPr>
-        <w:spacing w:after="140" w:line="280"/>
+        <w:spacing w:after="100" w:line="264"/>
       </w:pPr>
       <w:r>
         <w:rPr>
           <w:rFonts w:ascii="Calibri" w:cs="Calibri" w:eastAsia="Calibri" w:hAnsi="Calibri"/>
           <w:color w:val="13293D"/>
-          <w:sz w:val="22"/>
-          <w:szCs w:val="22"/>
-        </w:rPr>
-        <w:t xml:space="preserve">He's mostly ______ by impact — he wants his work to matter.</w:t>
-      </w:r>
-    </w:p>
-    <w:p>
-      <w:pPr>
-        <w:spacing w:after="160" w:line="300"/>
+          <w:sz w:val="21"/>
+          <w:szCs w:val="21"/>
+        </w:rPr>
+        <w:t xml:space="preserve">He's mostly ______ by impact, he wants his work to matter.</w:t>
+      </w:r>
+    </w:p>
+    <w:p>
+      <w:pPr>
+        <w:spacing w:after="120" w:line="276"/>
       </w:pPr>
       <w:r>
         <w:rPr>
@@ -2717,8 +2854,8 @@
           <w:i/>
           <w:iCs/>
           <w:color w:val="444444"/>
-          <w:sz w:val="22"/>
-          <w:szCs w:val="22"/>
+          <w:sz w:val="21"/>
+          <w:szCs w:val="21"/>
         </w:rPr>
         <w:t xml:space="preserve">Gabarito: 1) milestone   2) outgoing   3) work in progress   4) rooted in   5) driven</w:t>
       </w:r>
@@ -2726,7 +2863,7 @@
     <w:p>
       <w:pPr>
         <w:shd w:fill="1B3B57" w:val="clear"/>
-        <w:spacing w:after="150" w:before="500"/>
+        <w:spacing w:after="110" w:before="340"/>
       </w:pPr>
       <w:r>
         <w:rPr>
@@ -2734,8 +2871,8 @@
           <w:b/>
           <w:bCs/>
           <w:color w:val="FFFFFF"/>
-          <w:sz w:val="20"/>
-          <w:szCs w:val="20"/>
+          <w:sz w:val="18"/>
+          <w:szCs w:val="18"/>
         </w:rPr>
         <w:t xml:space="preserve">  ETAPA 7  </w:t>
       </w:r>
@@ -2745,15 +2882,27 @@
           <w:b/>
           <w:bCs/>
           <w:color w:val="FFFFFF"/>
-          <w:sz w:val="24"/>
-          <w:szCs w:val="24"/>
+          <w:sz w:val="23"/>
+          <w:szCs w:val="23"/>
         </w:rPr>
         <w:t xml:space="preserve">   Autoavaliação de Performance</w:t>
       </w:r>
-    </w:p>
-    <w:p>
-      <w:pPr>
-        <w:spacing w:after="160" w:line="300"/>
+      <w:r>
+        <w:rPr>
+          <w:rFonts w:ascii="Calibri" w:cs="Calibri" w:eastAsia="Calibri" w:hAnsi="Calibri"/>
+          <w:i/>
+          <w:iCs/>
+          <w:color w:val="D8E7F2"/>
+          <w:sz w:val="17"/>
+          <w:szCs w:val="17"/>
+        </w:rPr>
+        <w:br/>
+        <w:t xml:space="preserve">   Self-Assessment</w:t>
+      </w:r>
+    </w:p>
+    <w:p>
+      <w:pPr>
+        <w:spacing w:after="120" w:line="276"/>
       </w:pPr>
       <w:r>
         <w:rPr>
@@ -2763,8 +2912,8 @@
           <w:i w:val="false"/>
           <w:iCs w:val="false"/>
           <w:color w:val="444444"/>
-          <w:sz w:val="22"/>
-          <w:szCs w:val="22"/>
+          <w:sz w:val="21"/>
+          <w:szCs w:val="21"/>
         </w:rPr>
         <w:t xml:space="preserve">Antes de marcar este tema como concluído, avalie honestamente como foi sua prática.</w:t>
       </w:r>
@@ -2795,10 +2944,10 @@
             <w:tcW w:type="dxa" w:w="4200"/>
             <w:shd w:fill="1B3B57" w:val="clear"/>
             <w:tcMar>
-              <w:top w:type="dxa" w:w="100"/>
-              <w:left w:type="dxa" w:w="120"/>
-              <w:bottom w:type="dxa" w:w="100"/>
-              <w:right w:type="dxa" w:w="120"/>
+              <w:top w:type="dxa" w:w="80"/>
+              <w:left w:type="dxa" w:w="110"/>
+              <w:bottom w:type="dxa" w:w="80"/>
+              <w:right w:type="dxa" w:w="110"/>
             </w:tcMar>
             <w:vAlign w:val="center"/>
           </w:tcPr>
@@ -2809,8 +2958,8 @@
                 <w:b/>
                 <w:bCs/>
                 <w:color w:val="FFFFFF"/>
-                <w:sz w:val="20"/>
-                <w:szCs w:val="20"/>
+                <w:sz w:val="19"/>
+                <w:szCs w:val="19"/>
               </w:rPr>
               <w:t xml:space="preserve">Critério</w:t>
             </w:r>
@@ -2821,10 +2970,10 @@
             <w:tcW w:type="dxa" w:w="3000"/>
             <w:shd w:fill="1B3B57" w:val="clear"/>
             <w:tcMar>
-              <w:top w:type="dxa" w:w="100"/>
-              <w:left w:type="dxa" w:w="120"/>
-              <w:bottom w:type="dxa" w:w="100"/>
-              <w:right w:type="dxa" w:w="120"/>
+              <w:top w:type="dxa" w:w="80"/>
+              <w:left w:type="dxa" w:w="110"/>
+              <w:bottom w:type="dxa" w:w="80"/>
+              <w:right w:type="dxa" w:w="110"/>
             </w:tcMar>
             <w:vAlign w:val="center"/>
           </w:tcPr>
@@ -2835,8 +2984,8 @@
                 <w:b/>
                 <w:bCs/>
                 <w:color w:val="FFFFFF"/>
-                <w:sz w:val="20"/>
-                <w:szCs w:val="20"/>
+                <w:sz w:val="19"/>
+                <w:szCs w:val="19"/>
               </w:rPr>
               <w:t xml:space="preserve">Como foi?</w:t>
             </w:r>
@@ -2847,10 +2996,10 @@
             <w:tcW w:type="dxa" w:w="2000"/>
             <w:shd w:fill="1B3B57" w:val="clear"/>
             <w:tcMar>
-              <w:top w:type="dxa" w:w="100"/>
-              <w:left w:type="dxa" w:w="120"/>
-              <w:bottom w:type="dxa" w:w="100"/>
-              <w:right w:type="dxa" w:w="120"/>
+              <w:top w:type="dxa" w:w="80"/>
+              <w:left w:type="dxa" w:w="110"/>
+              <w:bottom w:type="dxa" w:w="80"/>
+              <w:right w:type="dxa" w:w="110"/>
             </w:tcMar>
             <w:vAlign w:val="center"/>
           </w:tcPr>
@@ -2861,10 +3010,10 @@
                 <w:b/>
                 <w:bCs/>
                 <w:color w:val="FFFFFF"/>
-                <w:sz w:val="20"/>
-                <w:szCs w:val="20"/>
-              </w:rPr>
-              <w:t xml:space="preserve">Nota (1–5)</w:t>
+                <w:sz w:val="19"/>
+                <w:szCs w:val="19"/>
+              </w:rPr>
+              <w:t xml:space="preserve">Nota (1-5)</w:t>
             </w:r>
           </w:p>
         </w:tc>
@@ -2874,24 +3023,24 @@
           <w:tcPr>
             <w:tcW w:type="dxa" w:w="4200"/>
             <w:tcMar>
-              <w:top w:type="dxa" w:w="90"/>
-              <w:left w:type="dxa" w:w="120"/>
-              <w:bottom w:type="dxa" w:w="90"/>
-              <w:right w:type="dxa" w:w="120"/>
-            </w:tcMar>
-            <w:vAlign w:val="center"/>
-          </w:tcPr>
-          <w:p>
-            <w:r>
-              <w:rPr>
-                <w:rFonts w:ascii="Calibri" w:cs="Calibri" w:eastAsia="Calibri" w:hAnsi="Calibri"/>
-                <w:b w:val="false"/>
-                <w:bCs w:val="false"/>
-                <w:i w:val="false"/>
-                <w:iCs w:val="false"/>
-                <w:color w:val="444444"/>
-                <w:sz w:val="20"/>
-                <w:szCs w:val="20"/>
+              <w:top w:type="dxa" w:w="70"/>
+              <w:left w:type="dxa" w:w="110"/>
+              <w:bottom w:type="dxa" w:w="70"/>
+              <w:right w:type="dxa" w:w="110"/>
+            </w:tcMar>
+            <w:vAlign w:val="center"/>
+          </w:tcPr>
+          <w:p>
+            <w:r>
+              <w:rPr>
+                <w:rFonts w:ascii="Calibri" w:cs="Calibri" w:eastAsia="Calibri" w:hAnsi="Calibri"/>
+                <w:b w:val="false"/>
+                <w:bCs w:val="false"/>
+                <w:i w:val="false"/>
+                <w:iCs w:val="false"/>
+                <w:color w:val="444444"/>
+                <w:sz w:val="19"/>
+                <w:szCs w:val="19"/>
               </w:rPr>
               <w:t xml:space="preserve">Consegui usar o vocabulário novo sem parar para pensar</w:t>
             </w:r>
@@ -2901,24 +3050,24 @@
           <w:tcPr>
             <w:tcW w:type="dxa" w:w="3000"/>
             <w:tcMar>
-              <w:top w:type="dxa" w:w="90"/>
-              <w:left w:type="dxa" w:w="120"/>
-              <w:bottom w:type="dxa" w:w="90"/>
-              <w:right w:type="dxa" w:w="120"/>
-            </w:tcMar>
-            <w:vAlign w:val="center"/>
-          </w:tcPr>
-          <w:p>
-            <w:r>
-              <w:rPr>
-                <w:rFonts w:ascii="Calibri" w:cs="Calibri" w:eastAsia="Calibri" w:hAnsi="Calibri"/>
-                <w:b w:val="false"/>
-                <w:bCs w:val="false"/>
-                <w:i w:val="false"/>
-                <w:iCs w:val="false"/>
-                <w:color w:val="444444"/>
-                <w:sz w:val="20"/>
-                <w:szCs w:val="20"/>
+              <w:top w:type="dxa" w:w="70"/>
+              <w:left w:type="dxa" w:w="110"/>
+              <w:bottom w:type="dxa" w:w="70"/>
+              <w:right w:type="dxa" w:w="110"/>
+            </w:tcMar>
+            <w:vAlign w:val="center"/>
+          </w:tcPr>
+          <w:p>
+            <w:r>
+              <w:rPr>
+                <w:rFonts w:ascii="Calibri" w:cs="Calibri" w:eastAsia="Calibri" w:hAnsi="Calibri"/>
+                <w:b w:val="false"/>
+                <w:bCs w:val="false"/>
+                <w:i w:val="false"/>
+                <w:iCs w:val="false"/>
+                <w:color w:val="444444"/>
+                <w:sz w:val="19"/>
+                <w:szCs w:val="19"/>
               </w:rPr>
               <w:t xml:space="preserve"/>
             </w:r>
@@ -2928,24 +3077,24 @@
           <w:tcPr>
             <w:tcW w:type="dxa" w:w="2000"/>
             <w:tcMar>
-              <w:top w:type="dxa" w:w="90"/>
-              <w:left w:type="dxa" w:w="120"/>
-              <w:bottom w:type="dxa" w:w="90"/>
-              <w:right w:type="dxa" w:w="120"/>
-            </w:tcMar>
-            <w:vAlign w:val="center"/>
-          </w:tcPr>
-          <w:p>
-            <w:r>
-              <w:rPr>
-                <w:rFonts w:ascii="Calibri" w:cs="Calibri" w:eastAsia="Calibri" w:hAnsi="Calibri"/>
-                <w:b w:val="false"/>
-                <w:bCs w:val="false"/>
-                <w:i w:val="false"/>
-                <w:iCs w:val="false"/>
-                <w:color w:val="444444"/>
-                <w:sz w:val="20"/>
-                <w:szCs w:val="20"/>
+              <w:top w:type="dxa" w:w="70"/>
+              <w:left w:type="dxa" w:w="110"/>
+              <w:bottom w:type="dxa" w:w="70"/>
+              <w:right w:type="dxa" w:w="110"/>
+            </w:tcMar>
+            <w:vAlign w:val="center"/>
+          </w:tcPr>
+          <w:p>
+            <w:r>
+              <w:rPr>
+                <w:rFonts w:ascii="Calibri" w:cs="Calibri" w:eastAsia="Calibri" w:hAnsi="Calibri"/>
+                <w:b w:val="false"/>
+                <w:bCs w:val="false"/>
+                <w:i w:val="false"/>
+                <w:iCs w:val="false"/>
+                <w:color w:val="444444"/>
+                <w:sz w:val="19"/>
+                <w:szCs w:val="19"/>
               </w:rPr>
               <w:t xml:space="preserve"/>
             </w:r>
@@ -2957,24 +3106,24 @@
           <w:tcPr>
             <w:tcW w:type="dxa" w:w="4200"/>
             <w:tcMar>
-              <w:top w:type="dxa" w:w="90"/>
-              <w:left w:type="dxa" w:w="120"/>
-              <w:bottom w:type="dxa" w:w="90"/>
-              <w:right w:type="dxa" w:w="120"/>
-            </w:tcMar>
-            <w:vAlign w:val="center"/>
-          </w:tcPr>
-          <w:p>
-            <w:r>
-              <w:rPr>
-                <w:rFonts w:ascii="Calibri" w:cs="Calibri" w:eastAsia="Calibri" w:hAnsi="Calibri"/>
-                <w:b w:val="false"/>
-                <w:bCs w:val="false"/>
-                <w:i w:val="false"/>
-                <w:iCs w:val="false"/>
-                <w:color w:val="444444"/>
-                <w:sz w:val="20"/>
-                <w:szCs w:val="20"/>
+              <w:top w:type="dxa" w:w="70"/>
+              <w:left w:type="dxa" w:w="110"/>
+              <w:bottom w:type="dxa" w:w="70"/>
+              <w:right w:type="dxa" w:w="110"/>
+            </w:tcMar>
+            <w:vAlign w:val="center"/>
+          </w:tcPr>
+          <w:p>
+            <w:r>
+              <w:rPr>
+                <w:rFonts w:ascii="Calibri" w:cs="Calibri" w:eastAsia="Calibri" w:hAnsi="Calibri"/>
+                <w:b w:val="false"/>
+                <w:bCs w:val="false"/>
+                <w:i w:val="false"/>
+                <w:iCs w:val="false"/>
+                <w:color w:val="444444"/>
+                <w:sz w:val="19"/>
+                <w:szCs w:val="19"/>
               </w:rPr>
               <w:t xml:space="preserve">Entendi o áudio/vídeo sem depender da transcrição</w:t>
             </w:r>
@@ -2984,24 +3133,24 @@
           <w:tcPr>
             <w:tcW w:type="dxa" w:w="3000"/>
             <w:tcMar>
-              <w:top w:type="dxa" w:w="90"/>
-              <w:left w:type="dxa" w:w="120"/>
-              <w:bottom w:type="dxa" w:w="90"/>
-              <w:right w:type="dxa" w:w="120"/>
-            </w:tcMar>
-            <w:vAlign w:val="center"/>
-          </w:tcPr>
-          <w:p>
-            <w:r>
-              <w:rPr>
-                <w:rFonts w:ascii="Calibri" w:cs="Calibri" w:eastAsia="Calibri" w:hAnsi="Calibri"/>
-                <w:b w:val="false"/>
-                <w:bCs w:val="false"/>
-                <w:i w:val="false"/>
-                <w:iCs w:val="false"/>
-                <w:color w:val="444444"/>
-                <w:sz w:val="20"/>
-                <w:szCs w:val="20"/>
+              <w:top w:type="dxa" w:w="70"/>
+              <w:left w:type="dxa" w:w="110"/>
+              <w:bottom w:type="dxa" w:w="70"/>
+              <w:right w:type="dxa" w:w="110"/>
+            </w:tcMar>
+            <w:vAlign w:val="center"/>
+          </w:tcPr>
+          <w:p>
+            <w:r>
+              <w:rPr>
+                <w:rFonts w:ascii="Calibri" w:cs="Calibri" w:eastAsia="Calibri" w:hAnsi="Calibri"/>
+                <w:b w:val="false"/>
+                <w:bCs w:val="false"/>
+                <w:i w:val="false"/>
+                <w:iCs w:val="false"/>
+                <w:color w:val="444444"/>
+                <w:sz w:val="19"/>
+                <w:szCs w:val="19"/>
               </w:rPr>
               <w:t xml:space="preserve"/>
             </w:r>
@@ -3011,24 +3160,24 @@
           <w:tcPr>
             <w:tcW w:type="dxa" w:w="2000"/>
             <w:tcMar>
-              <w:top w:type="dxa" w:w="90"/>
-              <w:left w:type="dxa" w:w="120"/>
-              <w:bottom w:type="dxa" w:w="90"/>
-              <w:right w:type="dxa" w:w="120"/>
-            </w:tcMar>
-            <w:vAlign w:val="center"/>
-          </w:tcPr>
-          <w:p>
-            <w:r>
-              <w:rPr>
-                <w:rFonts w:ascii="Calibri" w:cs="Calibri" w:eastAsia="Calibri" w:hAnsi="Calibri"/>
-                <w:b w:val="false"/>
-                <w:bCs w:val="false"/>
-                <w:i w:val="false"/>
-                <w:iCs w:val="false"/>
-                <w:color w:val="444444"/>
-                <w:sz w:val="20"/>
-                <w:szCs w:val="20"/>
+              <w:top w:type="dxa" w:w="70"/>
+              <w:left w:type="dxa" w:w="110"/>
+              <w:bottom w:type="dxa" w:w="70"/>
+              <w:right w:type="dxa" w:w="110"/>
+            </w:tcMar>
+            <w:vAlign w:val="center"/>
+          </w:tcPr>
+          <w:p>
+            <w:r>
+              <w:rPr>
+                <w:rFonts w:ascii="Calibri" w:cs="Calibri" w:eastAsia="Calibri" w:hAnsi="Calibri"/>
+                <w:b w:val="false"/>
+                <w:bCs w:val="false"/>
+                <w:i w:val="false"/>
+                <w:iCs w:val="false"/>
+                <w:color w:val="444444"/>
+                <w:sz w:val="19"/>
+                <w:szCs w:val="19"/>
               </w:rPr>
               <w:t xml:space="preserve"/>
             </w:r>
@@ -3040,24 +3189,24 @@
           <w:tcPr>
             <w:tcW w:type="dxa" w:w="4200"/>
             <w:tcMar>
-              <w:top w:type="dxa" w:w="90"/>
-              <w:left w:type="dxa" w:w="120"/>
-              <w:bottom w:type="dxa" w:w="90"/>
-              <w:right w:type="dxa" w:w="120"/>
-            </w:tcMar>
-            <w:vAlign w:val="center"/>
-          </w:tcPr>
-          <w:p>
-            <w:r>
-              <w:rPr>
-                <w:rFonts w:ascii="Calibri" w:cs="Calibri" w:eastAsia="Calibri" w:hAnsi="Calibri"/>
-                <w:b w:val="false"/>
-                <w:bCs w:val="false"/>
-                <w:i w:val="false"/>
-                <w:iCs w:val="false"/>
-                <w:color w:val="444444"/>
-                <w:sz w:val="20"/>
-                <w:szCs w:val="20"/>
+              <w:top w:type="dxa" w:w="70"/>
+              <w:left w:type="dxa" w:w="110"/>
+              <w:bottom w:type="dxa" w:w="70"/>
+              <w:right w:type="dxa" w:w="110"/>
+            </w:tcMar>
+            <w:vAlign w:val="center"/>
+          </w:tcPr>
+          <w:p>
+            <w:r>
+              <w:rPr>
+                <w:rFonts w:ascii="Calibri" w:cs="Calibri" w:eastAsia="Calibri" w:hAnsi="Calibri"/>
+                <w:b w:val="false"/>
+                <w:bCs w:val="false"/>
+                <w:i w:val="false"/>
+                <w:iCs w:val="false"/>
+                <w:color w:val="444444"/>
+                <w:sz w:val="19"/>
+                <w:szCs w:val="19"/>
               </w:rPr>
               <w:t xml:space="preserve">Escrevi minhas respostas antes de falar</w:t>
             </w:r>
@@ -3067,24 +3216,24 @@
           <w:tcPr>
             <w:tcW w:type="dxa" w:w="3000"/>
             <w:tcMar>
-              <w:top w:type="dxa" w:w="90"/>
-              <w:left w:type="dxa" w:w="120"/>
-              <w:bottom w:type="dxa" w:w="90"/>
-              <w:right w:type="dxa" w:w="120"/>
-            </w:tcMar>
-            <w:vAlign w:val="center"/>
-          </w:tcPr>
-          <w:p>
-            <w:r>
-              <w:rPr>
-                <w:rFonts w:ascii="Calibri" w:cs="Calibri" w:eastAsia="Calibri" w:hAnsi="Calibri"/>
-                <w:b w:val="false"/>
-                <w:bCs w:val="false"/>
-                <w:i w:val="false"/>
-                <w:iCs w:val="false"/>
-                <w:color w:val="444444"/>
-                <w:sz w:val="20"/>
-                <w:szCs w:val="20"/>
+              <w:top w:type="dxa" w:w="70"/>
+              <w:left w:type="dxa" w:w="110"/>
+              <w:bottom w:type="dxa" w:w="70"/>
+              <w:right w:type="dxa" w:w="110"/>
+            </w:tcMar>
+            <w:vAlign w:val="center"/>
+          </w:tcPr>
+          <w:p>
+            <w:r>
+              <w:rPr>
+                <w:rFonts w:ascii="Calibri" w:cs="Calibri" w:eastAsia="Calibri" w:hAnsi="Calibri"/>
+                <w:b w:val="false"/>
+                <w:bCs w:val="false"/>
+                <w:i w:val="false"/>
+                <w:iCs w:val="false"/>
+                <w:color w:val="444444"/>
+                <w:sz w:val="19"/>
+                <w:szCs w:val="19"/>
               </w:rPr>
               <w:t xml:space="preserve"/>
             </w:r>
@@ -3094,24 +3243,24 @@
           <w:tcPr>
             <w:tcW w:type="dxa" w:w="2000"/>
             <w:tcMar>
-              <w:top w:type="dxa" w:w="90"/>
-              <w:left w:type="dxa" w:w="120"/>
-              <w:bottom w:type="dxa" w:w="90"/>
-              <w:right w:type="dxa" w:w="120"/>
-            </w:tcMar>
-            <w:vAlign w:val="center"/>
-          </w:tcPr>
-          <w:p>
-            <w:r>
-              <w:rPr>
-                <w:rFonts w:ascii="Calibri" w:cs="Calibri" w:eastAsia="Calibri" w:hAnsi="Calibri"/>
-                <w:b w:val="false"/>
-                <w:bCs w:val="false"/>
-                <w:i w:val="false"/>
-                <w:iCs w:val="false"/>
-                <w:color w:val="444444"/>
-                <w:sz w:val="20"/>
-                <w:szCs w:val="20"/>
+              <w:top w:type="dxa" w:w="70"/>
+              <w:left w:type="dxa" w:w="110"/>
+              <w:bottom w:type="dxa" w:w="70"/>
+              <w:right w:type="dxa" w:w="110"/>
+            </w:tcMar>
+            <w:vAlign w:val="center"/>
+          </w:tcPr>
+          <w:p>
+            <w:r>
+              <w:rPr>
+                <w:rFonts w:ascii="Calibri" w:cs="Calibri" w:eastAsia="Calibri" w:hAnsi="Calibri"/>
+                <w:b w:val="false"/>
+                <w:bCs w:val="false"/>
+                <w:i w:val="false"/>
+                <w:iCs w:val="false"/>
+                <w:color w:val="444444"/>
+                <w:sz w:val="19"/>
+                <w:szCs w:val="19"/>
               </w:rPr>
               <w:t xml:space="preserve"/>
             </w:r>
@@ -3123,24 +3272,24 @@
           <w:tcPr>
             <w:tcW w:type="dxa" w:w="4200"/>
             <w:tcMar>
-              <w:top w:type="dxa" w:w="90"/>
-              <w:left w:type="dxa" w:w="120"/>
-              <w:bottom w:type="dxa" w:w="90"/>
-              <w:right w:type="dxa" w:w="120"/>
-            </w:tcMar>
-            <w:vAlign w:val="center"/>
-          </w:tcPr>
-          <w:p>
-            <w:r>
-              <w:rPr>
-                <w:rFonts w:ascii="Calibri" w:cs="Calibri" w:eastAsia="Calibri" w:hAnsi="Calibri"/>
-                <w:b w:val="false"/>
-                <w:bCs w:val="false"/>
-                <w:i w:val="false"/>
-                <w:iCs w:val="false"/>
-                <w:color w:val="444444"/>
-                <w:sz w:val="20"/>
-                <w:szCs w:val="20"/>
+              <w:top w:type="dxa" w:w="70"/>
+              <w:left w:type="dxa" w:w="110"/>
+              <w:bottom w:type="dxa" w:w="70"/>
+              <w:right w:type="dxa" w:w="110"/>
+            </w:tcMar>
+            <w:vAlign w:val="center"/>
+          </w:tcPr>
+          <w:p>
+            <w:r>
+              <w:rPr>
+                <w:rFonts w:ascii="Calibri" w:cs="Calibri" w:eastAsia="Calibri" w:hAnsi="Calibri"/>
+                <w:b w:val="false"/>
+                <w:bCs w:val="false"/>
+                <w:i w:val="false"/>
+                <w:iCs w:val="false"/>
+                <w:color w:val="444444"/>
+                <w:sz w:val="19"/>
+                <w:szCs w:val="19"/>
               </w:rPr>
               <w:t xml:space="preserve">Apliquei a estrutura gramatical da etapa 5 corretamente</w:t>
             </w:r>
@@ -3150,24 +3299,24 @@
           <w:tcPr>
             <w:tcW w:type="dxa" w:w="3000"/>
             <w:tcMar>
-              <w:top w:type="dxa" w:w="90"/>
-              <w:left w:type="dxa" w:w="120"/>
-              <w:bottom w:type="dxa" w:w="90"/>
-              <w:right w:type="dxa" w:w="120"/>
-            </w:tcMar>
-            <w:vAlign w:val="center"/>
-          </w:tcPr>
-          <w:p>
-            <w:r>
-              <w:rPr>
-                <w:rFonts w:ascii="Calibri" w:cs="Calibri" w:eastAsia="Calibri" w:hAnsi="Calibri"/>
-                <w:b w:val="false"/>
-                <w:bCs w:val="false"/>
-                <w:i w:val="false"/>
-                <w:iCs w:val="false"/>
-                <w:color w:val="444444"/>
-                <w:sz w:val="20"/>
-                <w:szCs w:val="20"/>
+              <w:top w:type="dxa" w:w="70"/>
+              <w:left w:type="dxa" w:w="110"/>
+              <w:bottom w:type="dxa" w:w="70"/>
+              <w:right w:type="dxa" w:w="110"/>
+            </w:tcMar>
+            <w:vAlign w:val="center"/>
+          </w:tcPr>
+          <w:p>
+            <w:r>
+              <w:rPr>
+                <w:rFonts w:ascii="Calibri" w:cs="Calibri" w:eastAsia="Calibri" w:hAnsi="Calibri"/>
+                <w:b w:val="false"/>
+                <w:bCs w:val="false"/>
+                <w:i w:val="false"/>
+                <w:iCs w:val="false"/>
+                <w:color w:val="444444"/>
+                <w:sz w:val="19"/>
+                <w:szCs w:val="19"/>
               </w:rPr>
               <w:t xml:space="preserve"/>
             </w:r>
@@ -3177,24 +3326,24 @@
           <w:tcPr>
             <w:tcW w:type="dxa" w:w="2000"/>
             <w:tcMar>
-              <w:top w:type="dxa" w:w="90"/>
-              <w:left w:type="dxa" w:w="120"/>
-              <w:bottom w:type="dxa" w:w="90"/>
-              <w:right w:type="dxa" w:w="120"/>
-            </w:tcMar>
-            <w:vAlign w:val="center"/>
-          </w:tcPr>
-          <w:p>
-            <w:r>
-              <w:rPr>
-                <w:rFonts w:ascii="Calibri" w:cs="Calibri" w:eastAsia="Calibri" w:hAnsi="Calibri"/>
-                <w:b w:val="false"/>
-                <w:bCs w:val="false"/>
-                <w:i w:val="false"/>
-                <w:iCs w:val="false"/>
-                <w:color w:val="444444"/>
-                <w:sz w:val="20"/>
-                <w:szCs w:val="20"/>
+              <w:top w:type="dxa" w:w="70"/>
+              <w:left w:type="dxa" w:w="110"/>
+              <w:bottom w:type="dxa" w:w="70"/>
+              <w:right w:type="dxa" w:w="110"/>
+            </w:tcMar>
+            <w:vAlign w:val="center"/>
+          </w:tcPr>
+          <w:p>
+            <w:r>
+              <w:rPr>
+                <w:rFonts w:ascii="Calibri" w:cs="Calibri" w:eastAsia="Calibri" w:hAnsi="Calibri"/>
+                <w:b w:val="false"/>
+                <w:bCs w:val="false"/>
+                <w:i w:val="false"/>
+                <w:iCs w:val="false"/>
+                <w:color w:val="444444"/>
+                <w:sz w:val="19"/>
+                <w:szCs w:val="19"/>
               </w:rPr>
               <w:t xml:space="preserve"/>
             </w:r>
@@ -3206,24 +3355,24 @@
           <w:tcPr>
             <w:tcW w:type="dxa" w:w="4200"/>
             <w:tcMar>
-              <w:top w:type="dxa" w:w="90"/>
-              <w:left w:type="dxa" w:w="120"/>
-              <w:bottom w:type="dxa" w:w="90"/>
-              <w:right w:type="dxa" w:w="120"/>
-            </w:tcMar>
-            <w:vAlign w:val="center"/>
-          </w:tcPr>
-          <w:p>
-            <w:r>
-              <w:rPr>
-                <w:rFonts w:ascii="Calibri" w:cs="Calibri" w:eastAsia="Calibri" w:hAnsi="Calibri"/>
-                <w:b w:val="false"/>
-                <w:bCs w:val="false"/>
-                <w:i w:val="false"/>
-                <w:iCs w:val="false"/>
-                <w:color w:val="444444"/>
-                <w:sz w:val="20"/>
-                <w:szCs w:val="20"/>
+              <w:top w:type="dxa" w:w="70"/>
+              <w:left w:type="dxa" w:w="110"/>
+              <w:bottom w:type="dxa" w:w="70"/>
+              <w:right w:type="dxa" w:w="110"/>
+            </w:tcMar>
+            <w:vAlign w:val="center"/>
+          </w:tcPr>
+          <w:p>
+            <w:r>
+              <w:rPr>
+                <w:rFonts w:ascii="Calibri" w:cs="Calibri" w:eastAsia="Calibri" w:hAnsi="Calibri"/>
+                <w:b w:val="false"/>
+                <w:bCs w:val="false"/>
+                <w:i w:val="false"/>
+                <w:iCs w:val="false"/>
+                <w:color w:val="444444"/>
+                <w:sz w:val="19"/>
+                <w:szCs w:val="19"/>
               </w:rPr>
               <w:t xml:space="preserve">Sustentei minhas respostas por mais de 2 frases</w:t>
             </w:r>
@@ -3233,24 +3382,24 @@
           <w:tcPr>
             <w:tcW w:type="dxa" w:w="3000"/>
             <w:tcMar>
-              <w:top w:type="dxa" w:w="90"/>
-              <w:left w:type="dxa" w:w="120"/>
-              <w:bottom w:type="dxa" w:w="90"/>
-              <w:right w:type="dxa" w:w="120"/>
-            </w:tcMar>
-            <w:vAlign w:val="center"/>
-          </w:tcPr>
-          <w:p>
-            <w:r>
-              <w:rPr>
-                <w:rFonts w:ascii="Calibri" w:cs="Calibri" w:eastAsia="Calibri" w:hAnsi="Calibri"/>
-                <w:b w:val="false"/>
-                <w:bCs w:val="false"/>
-                <w:i w:val="false"/>
-                <w:iCs w:val="false"/>
-                <w:color w:val="444444"/>
-                <w:sz w:val="20"/>
-                <w:szCs w:val="20"/>
+              <w:top w:type="dxa" w:w="70"/>
+              <w:left w:type="dxa" w:w="110"/>
+              <w:bottom w:type="dxa" w:w="70"/>
+              <w:right w:type="dxa" w:w="110"/>
+            </w:tcMar>
+            <w:vAlign w:val="center"/>
+          </w:tcPr>
+          <w:p>
+            <w:r>
+              <w:rPr>
+                <w:rFonts w:ascii="Calibri" w:cs="Calibri" w:eastAsia="Calibri" w:hAnsi="Calibri"/>
+                <w:b w:val="false"/>
+                <w:bCs w:val="false"/>
+                <w:i w:val="false"/>
+                <w:iCs w:val="false"/>
+                <w:color w:val="444444"/>
+                <w:sz w:val="19"/>
+                <w:szCs w:val="19"/>
               </w:rPr>
               <w:t xml:space="preserve"/>
             </w:r>
@@ -3260,24 +3409,24 @@
           <w:tcPr>
             <w:tcW w:type="dxa" w:w="2000"/>
             <w:tcMar>
-              <w:top w:type="dxa" w:w="90"/>
-              <w:left w:type="dxa" w:w="120"/>
-              <w:bottom w:type="dxa" w:w="90"/>
-              <w:right w:type="dxa" w:w="120"/>
-            </w:tcMar>
-            <w:vAlign w:val="center"/>
-          </w:tcPr>
-          <w:p>
-            <w:r>
-              <w:rPr>
-                <w:rFonts w:ascii="Calibri" w:cs="Calibri" w:eastAsia="Calibri" w:hAnsi="Calibri"/>
-                <w:b w:val="false"/>
-                <w:bCs w:val="false"/>
-                <w:i w:val="false"/>
-                <w:iCs w:val="false"/>
-                <w:color w:val="444444"/>
-                <w:sz w:val="20"/>
-                <w:szCs w:val="20"/>
+              <w:top w:type="dxa" w:w="70"/>
+              <w:left w:type="dxa" w:w="110"/>
+              <w:bottom w:type="dxa" w:w="70"/>
+              <w:right w:type="dxa" w:w="110"/>
+            </w:tcMar>
+            <w:vAlign w:val="center"/>
+          </w:tcPr>
+          <w:p>
+            <w:r>
+              <w:rPr>
+                <w:rFonts w:ascii="Calibri" w:cs="Calibri" w:eastAsia="Calibri" w:hAnsi="Calibri"/>
+                <w:b w:val="false"/>
+                <w:bCs w:val="false"/>
+                <w:i w:val="false"/>
+                <w:iCs w:val="false"/>
+                <w:color w:val="444444"/>
+                <w:sz w:val="19"/>
+                <w:szCs w:val="19"/>
               </w:rPr>
               <w:t xml:space="preserve"/>
             </w:r>
@@ -3289,24 +3438,24 @@
           <w:tcPr>
             <w:tcW w:type="dxa" w:w="4200"/>
             <w:tcMar>
-              <w:top w:type="dxa" w:w="90"/>
-              <w:left w:type="dxa" w:w="120"/>
-              <w:bottom w:type="dxa" w:w="90"/>
-              <w:right w:type="dxa" w:w="120"/>
-            </w:tcMar>
-            <w:vAlign w:val="center"/>
-          </w:tcPr>
-          <w:p>
-            <w:r>
-              <w:rPr>
-                <w:rFonts w:ascii="Calibri" w:cs="Calibri" w:eastAsia="Calibri" w:hAnsi="Calibri"/>
-                <w:b w:val="false"/>
-                <w:bCs w:val="false"/>
-                <w:i w:val="false"/>
-                <w:iCs w:val="false"/>
-                <w:color w:val="444444"/>
-                <w:sz w:val="20"/>
-                <w:szCs w:val="20"/>
+              <w:top w:type="dxa" w:w="70"/>
+              <w:left w:type="dxa" w:w="110"/>
+              <w:bottom w:type="dxa" w:w="70"/>
+              <w:right w:type="dxa" w:w="110"/>
+            </w:tcMar>
+            <w:vAlign w:val="center"/>
+          </w:tcPr>
+          <w:p>
+            <w:r>
+              <w:rPr>
+                <w:rFonts w:ascii="Calibri" w:cs="Calibri" w:eastAsia="Calibri" w:hAnsi="Calibri"/>
+                <w:b w:val="false"/>
+                <w:bCs w:val="false"/>
+                <w:i w:val="false"/>
+                <w:iCs w:val="false"/>
+                <w:color w:val="444444"/>
+                <w:sz w:val="19"/>
+                <w:szCs w:val="19"/>
               </w:rPr>
               <w:t xml:space="preserve">Me senti confiante ao falar sobre este tema</w:t>
             </w:r>
@@ -3316,24 +3465,24 @@
           <w:tcPr>
             <w:tcW w:type="dxa" w:w="3000"/>
             <w:tcMar>
-              <w:top w:type="dxa" w:w="90"/>
-              <w:left w:type="dxa" w:w="120"/>
-              <w:bottom w:type="dxa" w:w="90"/>
-              <w:right w:type="dxa" w:w="120"/>
-            </w:tcMar>
-            <w:vAlign w:val="center"/>
-          </w:tcPr>
-          <w:p>
-            <w:r>
-              <w:rPr>
-                <w:rFonts w:ascii="Calibri" w:cs="Calibri" w:eastAsia="Calibri" w:hAnsi="Calibri"/>
-                <w:b w:val="false"/>
-                <w:bCs w:val="false"/>
-                <w:i w:val="false"/>
-                <w:iCs w:val="false"/>
-                <w:color w:val="444444"/>
-                <w:sz w:val="20"/>
-                <w:szCs w:val="20"/>
+              <w:top w:type="dxa" w:w="70"/>
+              <w:left w:type="dxa" w:w="110"/>
+              <w:bottom w:type="dxa" w:w="70"/>
+              <w:right w:type="dxa" w:w="110"/>
+            </w:tcMar>
+            <w:vAlign w:val="center"/>
+          </w:tcPr>
+          <w:p>
+            <w:r>
+              <w:rPr>
+                <w:rFonts w:ascii="Calibri" w:cs="Calibri" w:eastAsia="Calibri" w:hAnsi="Calibri"/>
+                <w:b w:val="false"/>
+                <w:bCs w:val="false"/>
+                <w:i w:val="false"/>
+                <w:iCs w:val="false"/>
+                <w:color w:val="444444"/>
+                <w:sz w:val="19"/>
+                <w:szCs w:val="19"/>
               </w:rPr>
               <w:t xml:space="preserve"/>
             </w:r>
@@ -3343,24 +3492,24 @@
           <w:tcPr>
             <w:tcW w:type="dxa" w:w="2000"/>
             <w:tcMar>
-              <w:top w:type="dxa" w:w="90"/>
-              <w:left w:type="dxa" w:w="120"/>
-              <w:bottom w:type="dxa" w:w="90"/>
-              <w:right w:type="dxa" w:w="120"/>
-            </w:tcMar>
-            <w:vAlign w:val="center"/>
-          </w:tcPr>
-          <w:p>
-            <w:r>
-              <w:rPr>
-                <w:rFonts w:ascii="Calibri" w:cs="Calibri" w:eastAsia="Calibri" w:hAnsi="Calibri"/>
-                <w:b w:val="false"/>
-                <w:bCs w:val="false"/>
-                <w:i w:val="false"/>
-                <w:iCs w:val="false"/>
-                <w:color w:val="444444"/>
-                <w:sz w:val="20"/>
-                <w:szCs w:val="20"/>
+              <w:top w:type="dxa" w:w="70"/>
+              <w:left w:type="dxa" w:w="110"/>
+              <w:bottom w:type="dxa" w:w="70"/>
+              <w:right w:type="dxa" w:w="110"/>
+            </w:tcMar>
+            <w:vAlign w:val="center"/>
+          </w:tcPr>
+          <w:p>
+            <w:r>
+              <w:rPr>
+                <w:rFonts w:ascii="Calibri" w:cs="Calibri" w:eastAsia="Calibri" w:hAnsi="Calibri"/>
+                <w:b w:val="false"/>
+                <w:bCs w:val="false"/>
+                <w:i w:val="false"/>
+                <w:iCs w:val="false"/>
+                <w:color w:val="444444"/>
+                <w:sz w:val="19"/>
+                <w:szCs w:val="19"/>
               </w:rPr>
               <w:t xml:space="preserve"/>
             </w:r>
@@ -3370,7 +3519,7 @@
     </w:tbl>
     <w:p>
       <w:pPr>
-        <w:spacing w:after="160" w:line="300"/>
+        <w:spacing w:after="120" w:line="276"/>
       </w:pPr>
       <w:r>
         <w:rPr>
@@ -3380,8 +3529,8 @@
           <w:i w:val="false"/>
           <w:iCs w:val="false"/>
           <w:color w:val="444444"/>
-          <w:sz w:val="22"/>
-          <w:szCs w:val="22"/>
+          <w:sz w:val="21"/>
+          <w:szCs w:val="21"/>
         </w:rPr>
         <w:t xml:space="preserve">O que travou mais nesta conversa? O que você quer treinar de novo antes de seguir para o próximo tema?</w:t>
       </w:r>
@@ -3391,12 +3540,12 @@
         <w:pBdr>
           <w:bottom w:val="single" w:color="C9D6E3" w:sz="4" w:space="4"/>
         </w:pBdr>
-        <w:spacing w:after="220"/>
-      </w:pPr>
-      <w:r>
-        <w:rPr>
-          <w:sz w:val="22"/>
-          <w:szCs w:val="22"/>
+        <w:spacing w:after="160"/>
+      </w:pPr>
+      <w:r>
+        <w:rPr>
+          <w:sz w:val="21"/>
+          <w:szCs w:val="21"/>
         </w:rPr>
         <w:t xml:space="preserve"> </w:t>
       </w:r>
@@ -3406,34 +3555,19 @@
         <w:pBdr>
           <w:bottom w:val="single" w:color="C9D6E3" w:sz="4" w:space="4"/>
         </w:pBdr>
-        <w:spacing w:after="220"/>
-      </w:pPr>
-      <w:r>
-        <w:rPr>
-          <w:sz w:val="22"/>
-          <w:szCs w:val="22"/>
+        <w:spacing w:after="160"/>
+      </w:pPr>
+      <w:r>
+        <w:rPr>
+          <w:sz w:val="21"/>
+          <w:szCs w:val="21"/>
         </w:rPr>
         <w:t xml:space="preserve"> </w:t>
       </w:r>
     </w:p>
     <w:p>
       <w:pPr>
-        <w:pBdr>
-          <w:bottom w:val="single" w:color="C9D6E3" w:sz="4" w:space="4"/>
-        </w:pBdr>
-        <w:spacing w:after="220"/>
-      </w:pPr>
-      <w:r>
-        <w:rPr>
-          <w:sz w:val="22"/>
-          <w:szCs w:val="22"/>
-        </w:rPr>
-        <w:t xml:space="preserve"> </w:t>
-      </w:r>
-    </w:p>
-    <w:p>
-      <w:pPr>
-        <w:spacing w:before="300"/>
+        <w:spacing w:before="220"/>
         <w:jc w:val="center"/>
       </w:pPr>
       <w:r>
@@ -3442,8 +3576,8 @@
           <w:b/>
           <w:bCs/>
           <w:color w:val="1B3B57"/>
-          <w:sz w:val="21"/>
-          <w:szCs w:val="21"/>
+          <w:sz w:val="20"/>
+          <w:szCs w:val="20"/>
         </w:rPr>
         <w:t xml:space="preserve">Marque este tema como concluído no seu Painel de Evolução e siga para o Tema 2.</w:t>
       </w:r>
@@ -3452,7 +3586,7 @@
       <w:headerReference w:type="default" r:id="rId7"/>
       <w:footerReference w:type="default" r:id="rId8"/>
       <w:pgSz w:w="11906" w:h="16838" w:orient="portrait"/>
-      <w:pgMar w:top="1000" w:right="1100" w:bottom="1000" w:left="1100" w:header="708" w:footer="708" w:gutter="0"/>
+      <w:pgMar w:top="800" w:right="1000" w:bottom="800" w:left="1000" w:header="708" w:footer="708" w:gutter="0"/>
       <w:pgNumType/>
       <w:docGrid w:linePitch="360"/>
     </w:sectPr>
@@ -3514,7 +3648,7 @@
         <w:sz w:val="16"/>
         <w:szCs w:val="16"/>
       </w:rPr>
-      <w:t xml:space="preserve">Bloco 1 — Fundamentos da Conversação   |   Página </w:t>
+      <w:t xml:space="preserve">Bloco 1 · Fundamentos da Conversação   |   Página </w:t>
     </w:r>
     <w:r>
       <w:rPr>
@@ -3582,7 +3716,7 @@
         <w:sz w:val="16"/>
         <w:szCs w:val="16"/>
       </w:rPr>
-      <w:t xml:space="preserve">English Speaking Practice — Nação Fluente</w:t>
+      <w:t xml:space="preserve">English Speaking Practice · Nação Fluente</w:t>
     </w:r>
   </w:p>
 </w:hdr>

</xml_diff>

<commit_message>
Add 416 audio files and apps/tools annex to English Speaking Practice
Generate 4 offline TTS audio files per theme (vocabulario, leitura,
dialogo, expressoes) via espeak-ng + lame, matching the 416-file count
already stated in the book's front matter. Wire the three new audio
references into Etapas 1, 2 and 6 of every chapter (HTML + DOCX).

Add a bilingual "Anexo: Aplicativos e Sites para Praticar Inglês"
appendix listing verified tools by category (pronunciation, speaking,
listening, vocabulary/grammar, reading, community, interview prep),
sourced from independently verified official URLs. Interview Warmup by
Google was confirmed discontinued in 2026 and replaced with ChatGPT
voice mode and Yoodli as interview-practice alternatives.

Regenerate all 104 standalone chapters and the master book (HTML/PDF/DOCX,
now 436 pages).
</commit_message>
<xml_diff>
--- a/ebook/output/Tema-01-talking-about-yourself-beyond-the.docx
+++ b/ebook/output/Tema-01-talking-about-yourself-beyond-the.docx
@@ -1345,6 +1345,24 @@
     </w:tbl>
     <w:p>
       <w:pPr>
+        <w:spacing w:after="120" w:line="276"/>
+      </w:pPr>
+      <w:r>
+        <w:rPr>
+          <w:rFonts w:ascii="Calibri" w:cs="Calibri" w:eastAsia="Calibri" w:hAnsi="Calibri"/>
+          <w:b w:val="false"/>
+          <w:bCs w:val="false"/>
+          <w:i/>
+          <w:iCs/>
+          <w:color w:val="444444"/>
+          <w:sz w:val="21"/>
+          <w:szCs w:val="21"/>
+        </w:rPr>
+        <w:t xml:space="preserve">Áudio com a pronúncia de cada palavra e seu exemplo (arquivo para download na plataforma: audio/tema-01-talking-about-yourself-vocabulario.mp3). Ouça e repita em voz alta.</w:t>
+      </w:r>
+    </w:p>
+    <w:p>
+      <w:pPr>
         <w:shd w:fill="178A6D" w:val="clear"/>
         <w:spacing w:after="110" w:before="340"/>
       </w:pPr>
@@ -1540,6 +1558,24 @@
           <w:szCs w:val="21"/>
         </w:rPr>
         <w:t xml:space="preserve">This isn't about memorizing a perfect script. It's about knowing three or four things: where you come from professionally, a milestone that shaped how you work, a trait you'd genuinely use to describe yourself, and something you're still working on. Once you have those four anchors, you can answer almost any version of "tell me about yourself."</w:t>
+      </w:r>
+    </w:p>
+    <w:p>
+      <w:pPr>
+        <w:spacing w:after="120" w:line="276"/>
+      </w:pPr>
+      <w:r>
+        <w:rPr>
+          <w:rFonts w:ascii="Calibri" w:cs="Calibri" w:eastAsia="Calibri" w:hAnsi="Calibri"/>
+          <w:b w:val="false"/>
+          <w:bCs w:val="false"/>
+          <w:i/>
+          <w:iCs/>
+          <w:color w:val="444444"/>
+          <w:sz w:val="21"/>
+          <w:szCs w:val="21"/>
+        </w:rPr>
+        <w:t xml:space="preserve">Áudio com a narração deste texto (arquivo para download na plataforma: audio/tema-01-talking-about-yourself-leitura.mp3). Ouça acompanhando a leitura, depois sem olhar para o texto.</w:t>
       </w:r>
     </w:p>
     <w:p>
@@ -2687,6 +2723,24 @@
           <w:szCs w:val="20"/>
         </w:rPr>
         <w:t xml:space="preserve">"That's actually a good question...", para ganhar 2 segundos antes de responder algo mais difícil.</w:t>
+      </w:r>
+    </w:p>
+    <w:p>
+      <w:pPr>
+        <w:spacing w:after="120" w:line="276"/>
+      </w:pPr>
+      <w:r>
+        <w:rPr>
+          <w:rFonts w:ascii="Calibri" w:cs="Calibri" w:eastAsia="Calibri" w:hAnsi="Calibri"/>
+          <w:b w:val="false"/>
+          <w:bCs w:val="false"/>
+          <w:i/>
+          <w:iCs/>
+          <w:color w:val="444444"/>
+          <w:sz w:val="21"/>
+          <w:szCs w:val="21"/>
+        </w:rPr>
+        <w:t xml:space="preserve">Áudio com a pronúncia de cada expressão (arquivo para download na plataforma: audio/tema-01-talking-about-yourself-expressoes.mp3).</w:t>
       </w:r>
     </w:p>
     <w:p>

</xml_diff>

<commit_message>
Turn audio filename mentions into clickable hyperlinks
Host the 416 audio files as public raw GitHub URLs (they're already
committed under ebook/audio/ on this branch) and replace every text-only
audio filename mention in each chapter (Etapas 1, 2, 3, 6) with a real
clickable link, in both the HTML/PDF (native PDF link annotations) and
DOCX (ExternalHyperlink) outputs. Clicking a link opens the mp3 directly
in the browser to play.

Regenerate all 104 standalone chapters and the master book.
</commit_message>
<xml_diff>
--- a/ebook/output/Tema-01-talking-about-yourself-beyond-the.docx
+++ b/ebook/output/Tema-01-talking-about-yourself-beyond-the.docx
@@ -1358,8 +1358,27 @@
           <w:sz w:val="21"/>
           <w:szCs w:val="21"/>
         </w:rPr>
-        <w:t xml:space="preserve">Áudio com a pronúncia de cada palavra e seu exemplo (arquivo para download na plataforma: audio/tema-01-talking-about-yourself-vocabulario.mp3). Ouça e repita em voz alta.</w:t>
-      </w:r>
+        <w:t xml:space="preserve">Áudio com a pronúncia de cada palavra e seu exemplo. Clique no link abaixo para ouvir e repita em voz alta.</w:t>
+      </w:r>
+    </w:p>
+    <w:p>
+      <w:pPr>
+        <w:spacing w:after="140" w:before="20"/>
+      </w:pPr>
+      <w:hyperlink w:history="1" r:id="rIdnhycr1glx-frvcl13emfa">
+        <w:r>
+          <w:rPr>
+            <w:rFonts w:ascii="Calibri" w:cs="Calibri" w:eastAsia="Calibri" w:hAnsi="Calibri"/>
+            <w:b/>
+            <w:bCs/>
+            <w:color w:val="1B3B57"/>
+            <w:sz w:val="20"/>
+            <w:szCs w:val="20"/>
+            <w:u w:val="single"/>
+          </w:rPr>
+          <w:t xml:space="preserve">▶ Ouvir o vocabulário deste tema</w:t>
+        </w:r>
+      </w:hyperlink>
     </w:p>
     <w:p>
       <w:pPr>
@@ -1575,8 +1594,27 @@
           <w:sz w:val="21"/>
           <w:szCs w:val="21"/>
         </w:rPr>
-        <w:t xml:space="preserve">Áudio com a narração deste texto (arquivo para download na plataforma: audio/tema-01-talking-about-yourself-leitura.mp3). Ouça acompanhando a leitura, depois sem olhar para o texto.</w:t>
-      </w:r>
+        <w:t xml:space="preserve">Áudio com a narração deste texto. Ouça acompanhando a leitura, depois sem olhar para o texto.</w:t>
+      </w:r>
+    </w:p>
+    <w:p>
+      <w:pPr>
+        <w:spacing w:after="140" w:before="20"/>
+      </w:pPr>
+      <w:hyperlink w:history="1" r:id="rIdqlovcxgpsekpgcfqmwef_">
+        <w:r>
+          <w:rPr>
+            <w:rFonts w:ascii="Calibri" w:cs="Calibri" w:eastAsia="Calibri" w:hAnsi="Calibri"/>
+            <w:b/>
+            <w:bCs/>
+            <w:color w:val="1B3B57"/>
+            <w:sz w:val="20"/>
+            <w:szCs w:val="20"/>
+            <w:u w:val="single"/>
+          </w:rPr>
+          <w:t xml:space="preserve">▶ Ouvir a leitura deste tema</w:t>
+        </w:r>
+      </w:hyperlink>
     </w:p>
     <w:p>
       <w:pPr>
@@ -1633,8 +1671,27 @@
           <w:sz w:val="21"/>
           <w:szCs w:val="21"/>
         </w:rPr>
-        <w:t xml:space="preserve">Ouça o áudio deste tema (arquivo disponível para download na plataforma: audio/tema-01-talking-about-yourself.mp3) com o roteiro abaixo. Primeiro sem ler, depois acompanhando o texto.</w:t>
-      </w:r>
+        <w:t xml:space="preserve">Ouça o áudio deste tema com o roteiro abaixo. Primeiro sem ler, depois acompanhando o texto.</w:t>
+      </w:r>
+    </w:p>
+    <w:p>
+      <w:pPr>
+        <w:spacing w:after="140" w:before="20"/>
+      </w:pPr>
+      <w:hyperlink w:history="1" r:id="rIdvwf9av1zpqtemdyey4aa-">
+        <w:r>
+          <w:rPr>
+            <w:rFonts w:ascii="Calibri" w:cs="Calibri" w:eastAsia="Calibri" w:hAnsi="Calibri"/>
+            <w:b/>
+            <w:bCs/>
+            <w:color w:val="1B3B57"/>
+            <w:sz w:val="20"/>
+            <w:szCs w:val="20"/>
+            <w:u w:val="single"/>
+          </w:rPr>
+          <w:t xml:space="preserve">▶ Ouvir o diálogo deste tema</w:t>
+        </w:r>
+      </w:hyperlink>
     </w:p>
     <w:tbl>
       <w:tblPr>
@@ -2740,8 +2797,27 @@
           <w:sz w:val="21"/>
           <w:szCs w:val="21"/>
         </w:rPr>
-        <w:t xml:space="preserve">Áudio com a pronúncia de cada expressão (arquivo para download na plataforma: audio/tema-01-talking-about-yourself-expressoes.mp3).</w:t>
-      </w:r>
+        <w:t xml:space="preserve">Áudio com a pronúncia de cada expressão.</w:t>
+      </w:r>
+    </w:p>
+    <w:p>
+      <w:pPr>
+        <w:spacing w:after="140" w:before="20"/>
+      </w:pPr>
+      <w:hyperlink w:history="1" r:id="rIdshkyg7zsg5390b0740w8m">
+        <w:r>
+          <w:rPr>
+            <w:rFonts w:ascii="Calibri" w:cs="Calibri" w:eastAsia="Calibri" w:hAnsi="Calibri"/>
+            <w:b/>
+            <w:bCs/>
+            <w:color w:val="1B3B57"/>
+            <w:sz w:val="20"/>
+            <w:szCs w:val="20"/>
+            <w:u w:val="single"/>
+          </w:rPr>
+          <w:t xml:space="preserve">▶ Ouvir as expressões deste tema</w:t>
+        </w:r>
+      </w:hyperlink>
     </w:p>
     <w:p>
       <w:pPr>

</xml_diff>